<commit_message>
chore: SRS document update 20.04.2026
</commit_message>
<xml_diff>
--- a/SmartUniversityGuideApp.docx
+++ b/SmartUniversityGuideApp.docx
@@ -379,7 +379,7 @@
           <w:lang w:eastAsia="en-GB"/>
           <w14:ligatures w14:val="none"/>
         </w:rPr>
-        <w:t>19</w:t>
+        <w:t>20</w:t>
       </w:r>
       <w:r>
         <w:rPr>
@@ -1856,7 +1856,7 @@
       </w:pPr>
       <w:r>
         <w:drawing>
-          <wp:inline wp14:editId="53BDD245" wp14:anchorId="02037835">
+          <wp:inline wp14:editId="5EEDD0AD" wp14:anchorId="02037835">
             <wp:extent cx="5473249" cy="5905605"/>
             <wp:effectExtent l="0" t="0" r="0" b="0"/>
             <wp:docPr id="1177894373" name="Picture 2"/>
@@ -2832,8 +2832,690 @@
     </w:p>
     <w:p>
       <w:pPr>
+        <w:shd w:val="clear" w:color="auto" w:fill="FFFFFF" w:themeFill="background1"/>
+        <w:spacing w:before="360" w:after="0" w:line="240" w:lineRule="auto"/>
+      </w:pPr>
+      <w:r>
+        <w:rPr>
+          <w:rFonts w:ascii="Times New Roman" w:hAnsi="Times New Roman" w:eastAsia="Times New Roman" w:cs="Times New Roman" w:asciiTheme="majorBidi" w:hAnsiTheme="majorBidi" w:cstheme="majorBidi"/>
+          <w:b w:val="1"/>
+          <w:bCs w:val="1"/>
+          <w:color w:val="373D3F"/>
+          <w:kern w:val="0"/>
+          <w:sz w:val="28"/>
+          <w:szCs w:val="28"/>
+          <w:lang w:eastAsia="en-GB"/>
+          <w14:ligatures w14:val="none"/>
+        </w:rPr>
+        <w:t>2.3. User Classes and Characteristics</w:t>
+      </w:r>
+    </w:p>
+    <w:p>
+      <w:pPr>
+        <w:spacing w:before="0" w:beforeAutospacing="off" w:after="225" w:afterAutospacing="off" w:line="240" w:lineRule="auto"/>
+        <w:rPr>
+          <w:rFonts w:ascii="Times New Roman" w:hAnsi="Times New Roman" w:eastAsia="Times New Roman" w:cs="Times New Roman"/>
+          <w:noProof w:val="0"/>
+          <w:kern w:val="0"/>
+          <w:sz w:val="28"/>
+          <w:szCs w:val="28"/>
+          <w:lang w:val="en-GB"/>
+          <w14:ligatures w14:val="none"/>
+        </w:rPr>
+      </w:pPr>
+      <w:r>
+        <w:rPr>
+          <w:rFonts w:ascii="Times New Roman" w:hAnsi="Times New Roman" w:eastAsia="Times New Roman" w:cs="Times New Roman"/>
+          <w:noProof w:val="0"/>
+          <w:sz w:val="28"/>
+          <w:szCs w:val="28"/>
+          <w:lang w:val="en-GB"/>
+        </w:rPr>
+        <w:t>Freshmen</w:t>
+      </w:r>
+      <w:r>
+        <w:rPr>
+          <w:rFonts w:ascii="Times New Roman" w:hAnsi="Times New Roman" w:eastAsia="Times New Roman" w:cs="Times New Roman"/>
+          <w:noProof w:val="0"/>
+          <w:sz w:val="28"/>
+          <w:szCs w:val="28"/>
+          <w:lang w:val="en-GB"/>
+        </w:rPr>
+        <w:t xml:space="preserve"> — primary users; low familiarity with campus systems, high frequency of onboarding-related queries, non-technical. Exchange/Erasmus students — </w:t>
+      </w:r>
+      <w:r>
+        <w:rPr>
+          <w:rFonts w:ascii="Times New Roman" w:hAnsi="Times New Roman" w:eastAsia="Times New Roman" w:cs="Times New Roman"/>
+          <w:noProof w:val="0"/>
+          <w:sz w:val="28"/>
+          <w:szCs w:val="28"/>
+          <w:lang w:val="en-GB"/>
+        </w:rPr>
+        <w:t>similar to</w:t>
+      </w:r>
+      <w:r>
+        <w:rPr>
+          <w:rFonts w:ascii="Times New Roman" w:hAnsi="Times New Roman" w:eastAsia="Times New Roman" w:cs="Times New Roman"/>
+          <w:noProof w:val="0"/>
+          <w:sz w:val="28"/>
+          <w:szCs w:val="28"/>
+          <w:lang w:val="en-GB"/>
+        </w:rPr>
+        <w:t xml:space="preserve"> </w:t>
+      </w:r>
+      <w:r>
+        <w:rPr>
+          <w:rFonts w:ascii="Times New Roman" w:hAnsi="Times New Roman" w:eastAsia="Times New Roman" w:cs="Times New Roman"/>
+          <w:noProof w:val="0"/>
+          <w:sz w:val="28"/>
+          <w:szCs w:val="28"/>
+          <w:lang w:val="en-GB"/>
+        </w:rPr>
+        <w:t>freshmen</w:t>
+      </w:r>
+      <w:r>
+        <w:rPr>
+          <w:rFonts w:ascii="Times New Roman" w:hAnsi="Times New Roman" w:eastAsia="Times New Roman" w:cs="Times New Roman"/>
+          <w:noProof w:val="0"/>
+          <w:sz w:val="28"/>
+          <w:szCs w:val="28"/>
+          <w:lang w:val="en-GB"/>
+        </w:rPr>
+        <w:t xml:space="preserve"> but may require multilingual support (English minimum). Returning students — occasional users for event discovery and cafeteria ordering. University staff (admin) — publish announcements and events; interact via a separate admin panel not covered in this SRS.</w:t>
+      </w:r>
+      <w:proofErr w:type="gramStart"/>
+      <w:proofErr w:type="gramEnd"/>
+    </w:p>
+    <w:p>
+      <w:pPr>
+        <w:shd w:val="clear" w:color="auto" w:fill="FFFFFF" w:themeFill="background1"/>
+        <w:spacing w:before="240" w:after="0" w:line="240" w:lineRule="auto"/>
+        <w:jc w:val="both"/>
+        <w:rPr>
+          <w:rFonts w:ascii="Times New Roman" w:hAnsi="Times New Roman" w:eastAsia="Times New Roman" w:cs="Times New Roman" w:asciiTheme="majorBidi" w:hAnsiTheme="majorBidi" w:cstheme="majorBidi"/>
+          <w:b w:val="1"/>
+          <w:bCs w:val="1"/>
+          <w:color w:val="373D3F"/>
+          <w:sz w:val="28"/>
+          <w:szCs w:val="28"/>
+          <w:lang w:eastAsia="en-GB"/>
+        </w:rPr>
+      </w:pPr>
+      <w:r>
+        <w:rPr>
+          <w:rFonts w:ascii="Times New Roman" w:hAnsi="Times New Roman" w:eastAsia="Times New Roman" w:cs="Times New Roman" w:asciiTheme="majorBidi" w:hAnsiTheme="majorBidi" w:cstheme="majorBidi"/>
+          <w:b w:val="1"/>
+          <w:bCs w:val="1"/>
+          <w:color w:val="373D3F"/>
+          <w:kern w:val="0"/>
+          <w:sz w:val="28"/>
+          <w:szCs w:val="28"/>
+          <w:lang w:eastAsia="en-GB"/>
+          <w14:ligatures w14:val="none"/>
+        </w:rPr>
+        <w:t>2.4. Operating Environment</w:t>
+      </w:r>
+    </w:p>
+    <w:p>
+      <w:pPr>
+        <w:spacing w:before="0" w:beforeAutospacing="off" w:after="225" w:afterAutospacing="off" w:line="240" w:lineRule="auto"/>
+        <w:jc w:val="both"/>
+        <w:rPr>
+          <w:rFonts w:ascii="Times New Roman" w:hAnsi="Times New Roman" w:eastAsia="Times New Roman" w:cs="Times New Roman"/>
+          <w:noProof w:val="0"/>
+          <w:kern w:val="0"/>
+          <w:sz w:val="28"/>
+          <w:szCs w:val="28"/>
+          <w:lang w:val="en-GB"/>
+          <w14:ligatures w14:val="none"/>
+        </w:rPr>
+      </w:pPr>
+      <w:r>
+        <w:rPr>
+          <w:rFonts w:ascii="Times New Roman" w:hAnsi="Times New Roman" w:eastAsia="Times New Roman" w:cs="Times New Roman"/>
+          <w:noProof w:val="0"/>
+          <w:sz w:val="28"/>
+          <w:szCs w:val="28"/>
+          <w:lang w:val="en-GB"/>
+        </w:rPr>
+        <w:t>The app shall run on Android 10+ and iOS 15+ as a React Native mobile application, and on modern web browsers (Chrome 110+, Firefox 110+, Safari 16+) as a Progressive Web App. The backend shall be hosted on a cloud platform (e.g. AWS or Azure) with a RESTful API. The system requires an active internet connection; offline caching of the campus map is a low-priority optional feature.</w:t>
+      </w:r>
+      <w:proofErr w:type="gramStart"/>
+      <w:proofErr w:type="gramEnd"/>
+    </w:p>
+    <w:p>
+      <w:pPr>
+        <w:shd w:val="clear" w:color="auto" w:fill="FFFFFF" w:themeFill="background1"/>
+        <w:spacing w:before="240" w:after="0" w:line="240" w:lineRule="auto"/>
+        <w:jc w:val="both"/>
+      </w:pPr>
+      <w:r>
+        <w:rPr>
+          <w:rFonts w:ascii="Times New Roman" w:hAnsi="Times New Roman" w:eastAsia="Times New Roman" w:cs="Times New Roman" w:asciiTheme="majorBidi" w:hAnsiTheme="majorBidi" w:cstheme="majorBidi"/>
+          <w:b w:val="1"/>
+          <w:bCs w:val="1"/>
+          <w:color w:val="373D3F"/>
+          <w:kern w:val="0"/>
+          <w:sz w:val="28"/>
+          <w:szCs w:val="28"/>
+          <w:lang w:eastAsia="en-GB"/>
+          <w14:ligatures w14:val="none"/>
+        </w:rPr>
+        <w:t>2.5. Design and Implementation Constraints</w:t>
+      </w:r>
+    </w:p>
+    <w:p>
+      <w:pPr>
+        <w:pStyle w:val="ListParagraph"/>
+        <w:numPr>
+          <w:ilvl w:val="0"/>
+          <w:numId w:val="5"/>
+        </w:numPr>
+        <w:shd w:val="clear" w:color="auto" w:fill="FFFFFF" w:themeFill="background1"/>
+        <w:spacing w:before="240" w:after="0" w:line="240" w:lineRule="auto"/>
+        <w:jc w:val="both"/>
+        <w:rPr>
+          <w:rFonts w:ascii="Times New Roman" w:hAnsi="Times New Roman" w:eastAsia="Times New Roman" w:cs="Times New Roman"/>
+          <w:noProof w:val="0"/>
+          <w:lang w:val="en-GB"/>
+        </w:rPr>
+      </w:pPr>
+      <w:r>
+        <w:rPr>
+          <w:rFonts w:ascii="Times New Roman" w:hAnsi="Times New Roman" w:eastAsia="Times New Roman" w:cs="Times New Roman"/>
+          <w:noProof w:val="0"/>
+          <w:lang w:val="en-GB"/>
+        </w:rPr>
+        <w:t>The app must comply with GDPR (EU Regulation 2016/679) regarding student personal data.</w:t>
+      </w:r>
+    </w:p>
+    <w:p>
+      <w:pPr>
+        <w:pStyle w:val="ListParagraph"/>
+        <w:numPr>
+          <w:ilvl w:val="0"/>
+          <w:numId w:val="5"/>
+        </w:numPr>
+        <w:shd w:val="clear" w:color="auto" w:fill="FFFFFF" w:themeFill="background1"/>
+        <w:spacing w:before="240" w:after="0" w:line="240" w:lineRule="auto"/>
+        <w:jc w:val="both"/>
+        <w:rPr>
+          <w:rFonts w:ascii="Times New Roman" w:hAnsi="Times New Roman" w:eastAsia="Times New Roman" w:cs="Times New Roman"/>
+          <w:noProof w:val="0"/>
+          <w:lang w:val="en-GB"/>
+        </w:rPr>
+      </w:pPr>
+      <w:r>
+        <w:rPr>
+          <w:rFonts w:ascii="Times New Roman" w:hAnsi="Times New Roman" w:eastAsia="Times New Roman" w:cs="Times New Roman"/>
+          <w:noProof w:val="0"/>
+          <w:lang w:val="en-GB"/>
+        </w:rPr>
+        <w:t>The development team consists of 2–3 students with limited server infrastructure budget; serverless or free-tier cloud services are preferred.</w:t>
+      </w:r>
+    </w:p>
+    <w:p>
+      <w:pPr>
+        <w:pStyle w:val="ListParagraph"/>
+        <w:numPr>
+          <w:ilvl w:val="0"/>
+          <w:numId w:val="5"/>
+        </w:numPr>
+        <w:shd w:val="clear" w:color="auto" w:fill="FFFFFF" w:themeFill="background1"/>
+        <w:spacing w:before="240" w:after="0" w:line="240" w:lineRule="auto"/>
+        <w:jc w:val="both"/>
+        <w:rPr>
+          <w:rFonts w:ascii="Times New Roman" w:hAnsi="Times New Roman" w:eastAsia="Times New Roman" w:cs="Times New Roman"/>
+          <w:noProof w:val="0"/>
+          <w:lang w:val="en-GB"/>
+        </w:rPr>
+      </w:pPr>
+      <w:r>
+        <w:rPr>
+          <w:rFonts w:ascii="Times New Roman" w:hAnsi="Times New Roman" w:eastAsia="Times New Roman" w:cs="Times New Roman"/>
+          <w:noProof w:val="0"/>
+          <w:lang w:val="en-GB"/>
+        </w:rPr>
+        <w:t>The UI must support English and Polish languages from launch.</w:t>
+      </w:r>
+    </w:p>
+    <w:p>
+      <w:pPr>
+        <w:shd w:val="clear" w:color="auto" w:fill="FFFFFF" w:themeFill="background1"/>
+        <w:spacing w:before="240" w:after="0" w:line="240" w:lineRule="auto"/>
+        <w:jc w:val="both"/>
+      </w:pPr>
+      <w:r>
+        <w:rPr>
+          <w:rFonts w:ascii="Times New Roman" w:hAnsi="Times New Roman" w:eastAsia="Times New Roman" w:cs="Times New Roman" w:asciiTheme="majorBidi" w:hAnsiTheme="majorBidi" w:cstheme="majorBidi"/>
+          <w:b w:val="1"/>
+          <w:bCs w:val="1"/>
+          <w:color w:val="373D3F"/>
+          <w:kern w:val="0"/>
+          <w:sz w:val="28"/>
+          <w:szCs w:val="28"/>
+          <w:lang w:eastAsia="en-GB"/>
+          <w14:ligatures w14:val="none"/>
+        </w:rPr>
+        <w:t>2.6. User Documentation</w:t>
+      </w:r>
+    </w:p>
+    <w:p>
+      <w:pPr>
+        <w:pStyle w:val="ListParagraph"/>
+        <w:numPr>
+          <w:ilvl w:val="0"/>
+          <w:numId w:val="6"/>
+        </w:numPr>
+        <w:shd w:val="clear" w:color="auto" w:fill="FFFFFF" w:themeFill="background1"/>
+        <w:spacing w:before="240" w:after="0" w:line="240" w:lineRule="auto"/>
+        <w:jc w:val="both"/>
+        <w:rPr>
+          <w:rFonts w:ascii="Times New Roman" w:hAnsi="Times New Roman" w:eastAsia="Times New Roman" w:cs="Times New Roman"/>
+          <w:noProof w:val="0"/>
+          <w:lang w:val="en-GB"/>
+        </w:rPr>
+      </w:pPr>
+      <w:r>
+        <w:rPr>
+          <w:rFonts w:ascii="Times New Roman" w:hAnsi="Times New Roman" w:eastAsia="Times New Roman" w:cs="Times New Roman"/>
+          <w:noProof w:val="0"/>
+          <w:lang w:val="en-GB"/>
+        </w:rPr>
+        <w:t>In-app onboarding tutorial (interactive walkthrough on first launch)</w:t>
+      </w:r>
+    </w:p>
+    <w:p>
+      <w:pPr>
+        <w:pStyle w:val="ListParagraph"/>
+        <w:numPr>
+          <w:ilvl w:val="0"/>
+          <w:numId w:val="6"/>
+        </w:numPr>
+        <w:shd w:val="clear" w:color="auto" w:fill="FFFFFF" w:themeFill="background1"/>
+        <w:spacing w:before="240" w:after="0" w:line="240" w:lineRule="auto"/>
+        <w:jc w:val="both"/>
+        <w:rPr>
+          <w:rFonts w:ascii="Times New Roman" w:hAnsi="Times New Roman" w:eastAsia="Times New Roman" w:cs="Times New Roman"/>
+          <w:noProof w:val="0"/>
+          <w:lang w:val="en-GB"/>
+        </w:rPr>
+      </w:pPr>
+      <w:r>
+        <w:rPr>
+          <w:noProof w:val="0"/>
+          <w:lang w:val="en-GB"/>
+        </w:rPr>
+        <w:t>I</w:t>
+      </w:r>
+      <w:r>
+        <w:rPr>
+          <w:rFonts w:ascii="Times New Roman" w:hAnsi="Times New Roman" w:eastAsia="Times New Roman" w:cs="Times New Roman"/>
+          <w:noProof w:val="0"/>
+          <w:lang w:val="en-GB"/>
+        </w:rPr>
+        <w:t>n-app FAQ section accessible from the main menu</w:t>
+      </w:r>
+    </w:p>
+    <w:p>
+      <w:pPr>
+        <w:pStyle w:val="ListParagraph"/>
+        <w:numPr>
+          <w:ilvl w:val="0"/>
+          <w:numId w:val="6"/>
+        </w:numPr>
+        <w:shd w:val="clear" w:color="auto" w:fill="FFFFFF" w:themeFill="background1"/>
+        <w:spacing w:before="240" w:after="0" w:line="240" w:lineRule="auto"/>
+        <w:jc w:val="both"/>
+        <w:rPr>
+          <w:rFonts w:ascii="Times New Roman" w:hAnsi="Times New Roman" w:eastAsia="Times New Roman" w:cs="Times New Roman"/>
+          <w:noProof w:val="0"/>
+          <w:lang w:val="en-GB"/>
+        </w:rPr>
+      </w:pPr>
+      <w:r>
+        <w:rPr>
+          <w:rFonts w:ascii="Times New Roman" w:hAnsi="Times New Roman" w:eastAsia="Times New Roman" w:cs="Times New Roman"/>
+          <w:noProof w:val="0"/>
+          <w:lang w:val="en-GB"/>
+        </w:rPr>
+        <w:t>PDF quick-start guide for distribution during freshman orientation</w:t>
+      </w:r>
+    </w:p>
+    <w:p>
+      <w:pPr>
+        <w:shd w:val="clear" w:color="auto" w:fill="FFFFFF" w:themeFill="background1"/>
+        <w:spacing w:before="240" w:after="0" w:line="240" w:lineRule="auto"/>
+        <w:jc w:val="both"/>
+        <w:rPr>
+          <w:rFonts w:ascii="Times New Roman" w:hAnsi="Times New Roman" w:eastAsia="Times New Roman" w:cs="Times New Roman" w:asciiTheme="majorBidi" w:hAnsiTheme="majorBidi" w:cstheme="majorBidi"/>
+          <w:color w:val="0000FF"/>
+          <w:sz w:val="20"/>
+          <w:szCs w:val="20"/>
+          <w:lang w:eastAsia="en-GB"/>
+        </w:rPr>
+      </w:pPr>
+    </w:p>
+    <w:p>
+      <w:pPr>
+        <w:shd w:val="clear" w:color="auto" w:fill="FFFFFF" w:themeFill="background1"/>
+        <w:spacing w:before="240" w:after="0" w:line="240" w:lineRule="auto"/>
+        <w:jc w:val="both"/>
+        <w:rPr>
+          <w:rFonts w:ascii="Times New Roman" w:hAnsi="Times New Roman" w:eastAsia="Times New Roman" w:cs="Times New Roman" w:asciiTheme="majorBidi" w:hAnsiTheme="majorBidi" w:cstheme="majorBidi"/>
+          <w:color w:val="0000FF"/>
+          <w:sz w:val="20"/>
+          <w:szCs w:val="20"/>
+          <w:lang w:eastAsia="en-GB"/>
+        </w:rPr>
+      </w:pPr>
+    </w:p>
+    <w:p>
+      <w:pPr>
+        <w:shd w:val="clear" w:color="auto" w:fill="FFFFFF" w:themeFill="background1"/>
+        <w:spacing w:before="240" w:after="0" w:line="240" w:lineRule="auto"/>
+        <w:jc w:val="both"/>
+        <w:rPr>
+          <w:rFonts w:ascii="Times New Roman" w:hAnsi="Times New Roman" w:eastAsia="Times New Roman" w:cs="Times New Roman" w:asciiTheme="majorBidi" w:hAnsiTheme="majorBidi" w:cstheme="majorBidi"/>
+          <w:b w:val="1"/>
+          <w:bCs w:val="1"/>
+          <w:color w:val="373D3F"/>
+          <w:kern w:val="0"/>
+          <w:sz w:val="28"/>
+          <w:szCs w:val="28"/>
+          <w:lang w:eastAsia="en-GB"/>
+          <w14:ligatures w14:val="none"/>
+        </w:rPr>
+      </w:pPr>
+      <w:r>
+        <w:rPr>
+          <w:rFonts w:ascii="Times New Roman" w:hAnsi="Times New Roman" w:eastAsia="Times New Roman" w:cs="Times New Roman" w:asciiTheme="majorBidi" w:hAnsiTheme="majorBidi" w:cstheme="majorBidi"/>
+          <w:b w:val="1"/>
+          <w:bCs w:val="1"/>
+          <w:color w:val="373D3F"/>
+          <w:kern w:val="0"/>
+          <w:sz w:val="28"/>
+          <w:szCs w:val="28"/>
+          <w:lang w:eastAsia="en-GB"/>
+          <w14:ligatures w14:val="none"/>
+        </w:rPr>
+        <w:t>2.7. Assumptions and Dependencies</w:t>
+      </w:r>
+    </w:p>
+    <w:p>
+      <w:pPr>
+        <w:pStyle w:val="ListParagraph"/>
+        <w:numPr>
+          <w:ilvl w:val="0"/>
+          <w:numId w:val="7"/>
+        </w:numPr>
+        <w:shd w:val="clear" w:color="auto" w:fill="FFFFFF" w:themeFill="background1"/>
+        <w:spacing w:before="240" w:after="0" w:line="240" w:lineRule="auto"/>
+        <w:jc w:val="both"/>
+        <w:rPr>
+          <w:rFonts w:ascii="Times New Roman" w:hAnsi="Times New Roman" w:eastAsia="Times New Roman" w:cs="Times New Roman"/>
+          <w:noProof w:val="0"/>
+          <w:sz w:val="28"/>
+          <w:szCs w:val="28"/>
+          <w:lang w:val="en-GB"/>
+        </w:rPr>
+      </w:pPr>
+      <w:r>
+        <w:rPr>
+          <w:rFonts w:ascii="Times New Roman" w:hAnsi="Times New Roman" w:eastAsia="Times New Roman" w:cs="Times New Roman"/>
+          <w:noProof w:val="0"/>
+          <w:sz w:val="28"/>
+          <w:szCs w:val="28"/>
+          <w:lang w:val="en-GB"/>
+        </w:rPr>
+        <w:t>It is assumed that Lodz University of Technology will provide or permit scraping of publicly available data (cafeteria menus, event listings, timetables).</w:t>
+      </w:r>
+    </w:p>
+    <w:p>
+      <w:pPr>
+        <w:pStyle w:val="ListParagraph"/>
+        <w:numPr>
+          <w:ilvl w:val="0"/>
+          <w:numId w:val="7"/>
+        </w:numPr>
+        <w:shd w:val="clear" w:color="auto" w:fill="FFFFFF" w:themeFill="background1"/>
+        <w:spacing w:before="240" w:after="0" w:line="240" w:lineRule="auto"/>
+        <w:jc w:val="both"/>
+        <w:rPr>
+          <w:rFonts w:ascii="Times New Roman" w:hAnsi="Times New Roman" w:eastAsia="Times New Roman" w:cs="Times New Roman"/>
+          <w:noProof w:val="0"/>
+          <w:sz w:val="28"/>
+          <w:szCs w:val="28"/>
+          <w:lang w:val="en-GB"/>
+        </w:rPr>
+      </w:pPr>
+      <w:r>
+        <w:rPr>
+          <w:rFonts w:ascii="Times New Roman" w:hAnsi="Times New Roman" w:eastAsia="Times New Roman" w:cs="Times New Roman"/>
+          <w:noProof w:val="0"/>
+          <w:sz w:val="28"/>
+          <w:szCs w:val="28"/>
+          <w:lang w:val="en-GB"/>
+        </w:rPr>
+        <w:t>Google Maps SDK (free tier) is assumed sufficient for campus navigation at the expected user volume.</w:t>
+      </w:r>
+    </w:p>
+    <w:p>
+      <w:pPr>
+        <w:pStyle w:val="ListParagraph"/>
+        <w:numPr>
+          <w:ilvl w:val="0"/>
+          <w:numId w:val="7"/>
+        </w:numPr>
+        <w:shd w:val="clear" w:color="auto" w:fill="FFFFFF" w:themeFill="background1"/>
+        <w:spacing w:before="240" w:after="0" w:line="240" w:lineRule="auto"/>
+        <w:jc w:val="both"/>
+        <w:rPr>
+          <w:rFonts w:ascii="Times New Roman" w:hAnsi="Times New Roman" w:eastAsia="Times New Roman" w:cs="Times New Roman"/>
+          <w:noProof w:val="0"/>
+          <w:sz w:val="28"/>
+          <w:szCs w:val="28"/>
+          <w:lang w:val="en-GB"/>
+        </w:rPr>
+      </w:pPr>
+      <w:r>
+        <w:rPr>
+          <w:rFonts w:ascii="Times New Roman" w:hAnsi="Times New Roman" w:eastAsia="Times New Roman" w:cs="Times New Roman"/>
+          <w:noProof w:val="0"/>
+          <w:sz w:val="28"/>
+          <w:szCs w:val="28"/>
+          <w:lang w:val="en-GB"/>
+        </w:rPr>
+        <w:t>Push notification delivery depends on Apple APNs and Google FCM services remaining available.</w:t>
+      </w:r>
+    </w:p>
+    <w:p>
+      <w:pPr>
+        <w:shd w:val="clear" w:color="auto" w:fill="FFFFFF" w:themeFill="background1"/>
+        <w:spacing w:before="240" w:after="0" w:line="240" w:lineRule="auto"/>
+        <w:jc w:val="both"/>
+      </w:pPr>
+      <w:r>
+        <w:rPr>
+          <w:rFonts w:ascii="Times New Roman" w:hAnsi="Times New Roman" w:eastAsia="Times New Roman" w:cs="Times New Roman" w:asciiTheme="majorBidi" w:hAnsiTheme="majorBidi" w:cstheme="majorBidi"/>
+          <w:b w:val="1"/>
+          <w:bCs w:val="1"/>
+          <w:color w:val="373D3F"/>
+          <w:kern w:val="0"/>
+          <w:sz w:val="28"/>
+          <w:szCs w:val="28"/>
+          <w:lang w:eastAsia="en-GB"/>
+          <w14:ligatures w14:val="none"/>
+        </w:rPr>
+        <w:t>3. System Features</w:t>
+      </w:r>
+    </w:p>
+    <w:p>
+      <w:pPr>
+        <w:pStyle w:val="ListParagraph"/>
+        <w:numPr>
+          <w:ilvl w:val="0"/>
+          <w:numId w:val="8"/>
+        </w:numPr>
+        <w:shd w:val="clear" w:color="auto" w:fill="FFFFFF" w:themeFill="background1"/>
+        <w:spacing w:before="240" w:after="0" w:line="240" w:lineRule="auto"/>
+        <w:jc w:val="both"/>
+        <w:rPr>
+          <w:rFonts w:ascii="Times New Roman" w:hAnsi="Times New Roman" w:eastAsia="Times New Roman" w:cs="Times New Roman"/>
+          <w:noProof w:val="0"/>
+          <w:sz w:val="28"/>
+          <w:szCs w:val="28"/>
+          <w:lang w:val="en-GB"/>
+        </w:rPr>
+      </w:pPr>
+      <w:r>
+        <w:rPr>
+          <w:rFonts w:ascii="Times New Roman" w:hAnsi="Times New Roman" w:eastAsia="Times New Roman" w:cs="Times New Roman"/>
+          <w:noProof w:val="0"/>
+          <w:sz w:val="28"/>
+          <w:szCs w:val="28"/>
+          <w:lang w:val="en-GB"/>
+        </w:rPr>
+        <w:t>Campus Navigation</w:t>
+      </w:r>
+    </w:p>
+    <w:p>
+      <w:pPr>
+        <w:pStyle w:val="ListParagraph"/>
+        <w:numPr>
+          <w:ilvl w:val="0"/>
+          <w:numId w:val="8"/>
+        </w:numPr>
+        <w:shd w:val="clear" w:color="auto" w:fill="FFFFFF" w:themeFill="background1"/>
+        <w:spacing w:before="240" w:after="0" w:line="240" w:lineRule="auto"/>
+        <w:jc w:val="both"/>
+        <w:rPr>
+          <w:rFonts w:ascii="Times New Roman" w:hAnsi="Times New Roman" w:eastAsia="Times New Roman" w:cs="Times New Roman"/>
+          <w:noProof w:val="0"/>
+          <w:sz w:val="28"/>
+          <w:szCs w:val="28"/>
+          <w:lang w:val="en-GB"/>
+        </w:rPr>
+      </w:pPr>
+      <w:r>
+        <w:rPr>
+          <w:rFonts w:ascii="Times New Roman" w:hAnsi="Times New Roman" w:eastAsia="Times New Roman" w:cs="Times New Roman"/>
+          <w:noProof w:val="0"/>
+          <w:sz w:val="28"/>
+          <w:szCs w:val="28"/>
+          <w:lang w:val="en-GB"/>
+        </w:rPr>
+        <w:t>Unified Event Feed</w:t>
+      </w:r>
+    </w:p>
+    <w:p>
+      <w:pPr>
+        <w:pStyle w:val="ListParagraph"/>
+        <w:numPr>
+          <w:ilvl w:val="0"/>
+          <w:numId w:val="8"/>
+        </w:numPr>
+        <w:shd w:val="clear" w:color="auto" w:fill="FFFFFF" w:themeFill="background1"/>
+        <w:spacing w:before="240" w:after="0" w:line="240" w:lineRule="auto"/>
+        <w:jc w:val="both"/>
+        <w:rPr>
+          <w:rFonts w:ascii="Times New Roman" w:hAnsi="Times New Roman" w:eastAsia="Times New Roman" w:cs="Times New Roman"/>
+          <w:noProof w:val="0"/>
+          <w:sz w:val="28"/>
+          <w:szCs w:val="28"/>
+          <w:lang w:val="en-GB"/>
+        </w:rPr>
+      </w:pPr>
+      <w:r>
+        <w:rPr>
+          <w:rFonts w:ascii="Times New Roman" w:hAnsi="Times New Roman" w:eastAsia="Times New Roman" w:cs="Times New Roman"/>
+          <w:noProof w:val="0"/>
+          <w:sz w:val="28"/>
+          <w:szCs w:val="28"/>
+          <w:lang w:val="en-GB"/>
+        </w:rPr>
+        <w:t>Library Access</w:t>
+      </w:r>
+    </w:p>
+    <w:p>
+      <w:pPr>
+        <w:pStyle w:val="ListParagraph"/>
+        <w:numPr>
+          <w:ilvl w:val="0"/>
+          <w:numId w:val="8"/>
+        </w:numPr>
+        <w:shd w:val="clear" w:color="auto" w:fill="FFFFFF" w:themeFill="background1"/>
+        <w:spacing w:before="240" w:after="0" w:line="240" w:lineRule="auto"/>
+        <w:jc w:val="both"/>
+        <w:rPr>
+          <w:rFonts w:ascii="Times New Roman" w:hAnsi="Times New Roman" w:eastAsia="Times New Roman" w:cs="Times New Roman"/>
+          <w:noProof w:val="0"/>
+          <w:sz w:val="28"/>
+          <w:szCs w:val="28"/>
+          <w:lang w:val="en-GB"/>
+        </w:rPr>
+      </w:pPr>
+      <w:r>
+        <w:rPr>
+          <w:rFonts w:ascii="Times New Roman" w:hAnsi="Times New Roman" w:eastAsia="Times New Roman" w:cs="Times New Roman"/>
+          <w:noProof w:val="0"/>
+          <w:sz w:val="28"/>
+          <w:szCs w:val="28"/>
+          <w:lang w:val="en-GB"/>
+        </w:rPr>
+        <w:t>Student Services Hub</w:t>
+      </w:r>
+    </w:p>
+    <w:p>
+      <w:pPr>
+        <w:pStyle w:val="ListParagraph"/>
+        <w:numPr>
+          <w:ilvl w:val="0"/>
+          <w:numId w:val="8"/>
+        </w:numPr>
+        <w:shd w:val="clear" w:color="auto" w:fill="FFFFFF" w:themeFill="background1"/>
+        <w:spacing w:before="240" w:after="0" w:line="240" w:lineRule="auto"/>
+        <w:jc w:val="both"/>
+        <w:rPr>
+          <w:rFonts w:ascii="Times New Roman" w:hAnsi="Times New Roman" w:eastAsia="Times New Roman" w:cs="Times New Roman"/>
+          <w:noProof w:val="0"/>
+          <w:sz w:val="28"/>
+          <w:szCs w:val="28"/>
+          <w:lang w:val="en-GB"/>
+        </w:rPr>
+      </w:pPr>
+      <w:r>
+        <w:rPr>
+          <w:rFonts w:ascii="Times New Roman" w:hAnsi="Times New Roman" w:eastAsia="Times New Roman" w:cs="Times New Roman"/>
+          <w:noProof w:val="0"/>
+          <w:sz w:val="28"/>
+          <w:szCs w:val="28"/>
+          <w:lang w:val="en-GB"/>
+        </w:rPr>
+        <w:t>Transport Tracker</w:t>
+      </w:r>
+    </w:p>
+    <w:p>
+      <w:pPr>
+        <w:shd w:val="clear" w:color="auto" w:fill="FFFFFF" w:themeFill="background1"/>
+        <w:spacing w:before="240" w:after="0" w:line="240" w:lineRule="auto"/>
+        <w:jc w:val="both"/>
+        <w:rPr>
+          <w:rFonts w:ascii="Times New Roman" w:hAnsi="Times New Roman" w:eastAsia="Times New Roman" w:cs="Times New Roman" w:asciiTheme="majorBidi" w:hAnsiTheme="majorBidi" w:cstheme="majorBidi"/>
+          <w:b w:val="1"/>
+          <w:bCs w:val="1"/>
+          <w:color w:val="373D3F"/>
+          <w:sz w:val="28"/>
+          <w:szCs w:val="28"/>
+          <w:lang w:eastAsia="en-GB"/>
+        </w:rPr>
+      </w:pPr>
+    </w:p>
+    <w:p>
+      <w:pPr>
         <w:shd w:val="clear" w:color="auto" w:fill="FFFFFF"/>
-        <w:spacing w:before="360" w:after="0" w:line="240" w:lineRule="auto"/>
+        <w:spacing w:before="240" w:after="0" w:line="240" w:lineRule="auto"/>
+        <w:jc w:val="both"/>
         <w:rPr>
           <w:rFonts w:eastAsia="Times New Roman" w:asciiTheme="majorBidi" w:hAnsiTheme="majorBidi" w:cstheme="majorBidi"/>
           <w:color w:val="373D3F"/>
@@ -2856,51 +3538,8 @@
           <w:lang w:eastAsia="en-GB"/>
           <w14:ligatures w14:val="none"/>
         </w:rPr>
-        <w:t>2.3. User Classes and Characteristics  </w:t>
-      </w:r>
-    </w:p>
-    <w:p>
-      <w:pPr>
-        <w:shd w:val="clear" w:color="auto" w:fill="FFFFFF"/>
-        <w:spacing w:before="240" w:after="0" w:line="240" w:lineRule="auto"/>
-        <w:jc w:val="both"/>
-        <w:rPr>
-          <w:rFonts w:eastAsia="Times New Roman" w:asciiTheme="majorBidi" w:hAnsiTheme="majorBidi" w:cstheme="majorBidi"/>
-          <w:color w:val="373D3F"/>
-          <w:kern w:val="0"/>
-          <w:sz w:val="20"/>
-          <w:szCs w:val="20"/>
-          <w:lang w:eastAsia="en-GB"/>
-          <w14:ligatures w14:val="none"/>
-        </w:rPr>
-      </w:pPr>
-      <w:r>
-        <w:rPr>
-          <w:rFonts w:eastAsia="Times New Roman" w:asciiTheme="majorBidi" w:hAnsiTheme="majorBidi" w:cstheme="majorBidi"/>
-          <w:color w:val="0000FF"/>
-          <w:kern w:val="0"/>
-          <w:sz w:val="20"/>
-          <w:szCs w:val="20"/>
-          <w:lang w:eastAsia="en-GB"/>
-          <w14:ligatures w14:val="none"/>
-        </w:rPr>
-        <w:lastRenderedPageBreak/>
-        <w:t xml:space="preserve">«Identify the various user classes (intended target for the product) that you anticipate will use this product. User classes may be differentiated based on frequency of use, subset of product functions used, technical expertise, security or privilege levels, educational level, or experience. Describe the pertinent characteristics of each user class. Certain requirements may pertain only to certain user classes. Distinguish the most important user classes for this product from those who are less important to </w:t>
-      </w:r>
-      <w:proofErr w:type="gramStart"/>
-      <w:r>
-        <w:rPr>
-          <w:rFonts w:eastAsia="Times New Roman" w:asciiTheme="majorBidi" w:hAnsiTheme="majorBidi" w:cstheme="majorBidi"/>
-          <w:color w:val="0000FF"/>
-          <w:kern w:val="0"/>
-          <w:sz w:val="20"/>
-          <w:szCs w:val="20"/>
-          <w:lang w:eastAsia="en-GB"/>
-          <w14:ligatures w14:val="none"/>
-        </w:rPr>
-        <w:t>satisfy.»</w:t>
-      </w:r>
-      <w:proofErr w:type="gramEnd"/>
+        <w:t>4. External Interface Requirements</w:t>
+      </w:r>
     </w:p>
     <w:p>
       <w:pPr>
@@ -2929,7 +3568,7 @@
           <w:lang w:eastAsia="en-GB"/>
           <w14:ligatures w14:val="none"/>
         </w:rPr>
-        <w:t>2.4. Operating Environment</w:t>
+        <w:t>4.1. User Interfaces Overview</w:t>
       </w:r>
     </w:p>
     <w:p>
@@ -2957,7 +3596,7 @@
           <w:lang w:eastAsia="en-GB"/>
           <w14:ligatures w14:val="none"/>
         </w:rPr>
-        <w:t xml:space="preserve">«Describe the environment in which the software will operate, including the hardware platform, operating system and versions, and any other software components or applications with which it must peacefully </w:t>
+        <w:t xml:space="preserve">«Describe the </w:t>
       </w:r>
       <w:proofErr w:type="gramStart"/>
       <w:r>
@@ -2970,9 +3609,75 @@
           <w:lang w:eastAsia="en-GB"/>
           <w14:ligatures w14:val="none"/>
         </w:rPr>
-        <w:t>coexist.»</w:t>
+        <w:t>high level</w:t>
       </w:r>
       <w:proofErr w:type="gramEnd"/>
+      <w:r>
+        <w:rPr>
+          <w:rFonts w:eastAsia="Times New Roman" w:asciiTheme="majorBidi" w:hAnsiTheme="majorBidi" w:cstheme="majorBidi"/>
+          <w:color w:val="0000FF"/>
+          <w:kern w:val="0"/>
+          <w:sz w:val="20"/>
+          <w:szCs w:val="20"/>
+          <w:lang w:eastAsia="en-GB"/>
+          <w14:ligatures w14:val="none"/>
+        </w:rPr>
+        <w:t xml:space="preserve"> functionality of the system from the user’s perspective. Explain how the user should be able to use your system to complete all the expected features and the feedback information that will be displayed for the user (for each screen the user will see). For example, specify whether it is GUI or </w:t>
+      </w:r>
+      <w:proofErr w:type="gramStart"/>
+      <w:r>
+        <w:rPr>
+          <w:rFonts w:eastAsia="Times New Roman" w:asciiTheme="majorBidi" w:hAnsiTheme="majorBidi" w:cstheme="majorBidi"/>
+          <w:color w:val="0000FF"/>
+          <w:kern w:val="0"/>
+          <w:sz w:val="20"/>
+          <w:szCs w:val="20"/>
+          <w:lang w:eastAsia="en-GB"/>
+          <w14:ligatures w14:val="none"/>
+        </w:rPr>
+        <w:t>text based</w:t>
+      </w:r>
+      <w:proofErr w:type="gramEnd"/>
+      <w:r>
+        <w:rPr>
+          <w:rFonts w:eastAsia="Times New Roman" w:asciiTheme="majorBidi" w:hAnsiTheme="majorBidi" w:cstheme="majorBidi"/>
+          <w:color w:val="0000FF"/>
+          <w:kern w:val="0"/>
+          <w:sz w:val="20"/>
+          <w:szCs w:val="20"/>
+          <w:lang w:eastAsia="en-GB"/>
+          <w14:ligatures w14:val="none"/>
+        </w:rPr>
+        <w:t xml:space="preserve"> interface and how at high level it would work. Discuss at high level how user will interact with the game such as clicking buttons, typing in some selection character, etc.»</w:t>
+      </w:r>
+    </w:p>
+    <w:p>
+      <w:pPr>
+        <w:shd w:val="clear" w:color="auto" w:fill="FFFFFF"/>
+        <w:spacing w:before="240" w:after="0" w:line="240" w:lineRule="auto"/>
+        <w:jc w:val="both"/>
+        <w:rPr>
+          <w:rFonts w:eastAsia="Times New Roman" w:asciiTheme="majorBidi" w:hAnsiTheme="majorBidi" w:cstheme="majorBidi"/>
+          <w:color w:val="373D3F"/>
+          <w:kern w:val="0"/>
+          <w:sz w:val="20"/>
+          <w:szCs w:val="20"/>
+          <w:lang w:eastAsia="en-GB"/>
+          <w14:ligatures w14:val="none"/>
+        </w:rPr>
+      </w:pPr>
+      <w:r>
+        <w:rPr>
+          <w:rFonts w:eastAsia="Times New Roman" w:asciiTheme="majorBidi" w:hAnsiTheme="majorBidi" w:cstheme="majorBidi"/>
+          <w:color w:val="0000FF"/>
+          <w:kern w:val="0"/>
+          <w:sz w:val="20"/>
+          <w:szCs w:val="20"/>
+          <w:lang w:eastAsia="en-GB"/>
+          <w14:ligatures w14:val="none"/>
+        </w:rPr>
+        <w:t>«Describe the minimum requirements for the interface. This may include some sample screen images whether for text or GUI approach, any GUI standards or product family style guides that are to be followed, screen layout constraints, for GUI standard buttons and functions (e.g., help) that must appear on every screen, keyboard shortcuts, error message display standards, and so on»</w:t>
+      </w:r>
     </w:p>
     <w:p>
       <w:pPr>
@@ -3001,7 +3706,8 @@
           <w:lang w:eastAsia="en-GB"/>
           <w14:ligatures w14:val="none"/>
         </w:rPr>
-        <w:t>2.5. Design and Implementation Constraints</w:t>
+        <w:lastRenderedPageBreak/>
+        <w:t>4.2. Hardware Interfaces</w:t>
       </w:r>
     </w:p>
     <w:p>
@@ -3029,8 +3735,22 @@
           <w:lang w:eastAsia="en-GB"/>
           <w14:ligatures w14:val="none"/>
         </w:rPr>
-        <w:t>«Describe any items or issues that will limit the options available to the developers. These might include: corporate or regulatory policies; hardware limitations (timing requirements, memory requirements); interfaces to other applications; specific technologies, tools, and databases to be used; parallel operations; language requirements; communications protocols; security considerations; design conventions or programming standards (for example, if the customer’s organization will be responsible for maintaining the delivered software).»</w:t>
-      </w:r>
+        <w:t xml:space="preserve">«Describe the logical and physical characteristics of each interface between the software product and the hardware components of the system. This may include the supported device types, the nature of the data and control interactions between the software and the hardware, and communication protocols to be </w:t>
+      </w:r>
+      <w:proofErr w:type="gramStart"/>
+      <w:r>
+        <w:rPr>
+          <w:rFonts w:eastAsia="Times New Roman" w:asciiTheme="majorBidi" w:hAnsiTheme="majorBidi" w:cstheme="majorBidi"/>
+          <w:color w:val="0000FF"/>
+          <w:kern w:val="0"/>
+          <w:sz w:val="20"/>
+          <w:szCs w:val="20"/>
+          <w:lang w:eastAsia="en-GB"/>
+          <w14:ligatures w14:val="none"/>
+        </w:rPr>
+        <w:t>used.»</w:t>
+      </w:r>
+      <w:proofErr w:type="gramEnd"/>
     </w:p>
     <w:p>
       <w:pPr>
@@ -3059,151 +3779,7 @@
           <w:lang w:eastAsia="en-GB"/>
           <w14:ligatures w14:val="none"/>
         </w:rPr>
-        <w:t>2.6. User Documentation</w:t>
-      </w:r>
-    </w:p>
-    <w:p>
-      <w:pPr>
-        <w:shd w:val="clear" w:color="auto" w:fill="FFFFFF"/>
-        <w:spacing w:before="240" w:after="0" w:line="240" w:lineRule="auto"/>
-        <w:jc w:val="both"/>
-        <w:rPr>
-          <w:rFonts w:eastAsia="Times New Roman" w:asciiTheme="majorBidi" w:hAnsiTheme="majorBidi" w:cstheme="majorBidi"/>
-          <w:color w:val="373D3F"/>
-          <w:kern w:val="0"/>
-          <w:sz w:val="20"/>
-          <w:szCs w:val="20"/>
-          <w:lang w:eastAsia="en-GB"/>
-          <w14:ligatures w14:val="none"/>
-        </w:rPr>
-      </w:pPr>
-      <w:r>
-        <w:rPr>
-          <w:rFonts w:eastAsia="Times New Roman" w:asciiTheme="majorBidi" w:hAnsiTheme="majorBidi" w:cstheme="majorBidi"/>
-          <w:color w:val="0000FF"/>
-          <w:kern w:val="0"/>
-          <w:sz w:val="20"/>
-          <w:szCs w:val="20"/>
-          <w:lang w:eastAsia="en-GB"/>
-          <w14:ligatures w14:val="none"/>
-        </w:rPr>
-        <w:t xml:space="preserve">«List the user documentation components (such as user manuals, on-line help, and tutorials) that will be delivered along with the software. Identify any known user documentation delivery formats or </w:t>
-      </w:r>
-      <w:proofErr w:type="gramStart"/>
-      <w:r>
-        <w:rPr>
-          <w:rFonts w:eastAsia="Times New Roman" w:asciiTheme="majorBidi" w:hAnsiTheme="majorBidi" w:cstheme="majorBidi"/>
-          <w:color w:val="0000FF"/>
-          <w:kern w:val="0"/>
-          <w:sz w:val="20"/>
-          <w:szCs w:val="20"/>
-          <w:lang w:eastAsia="en-GB"/>
-          <w14:ligatures w14:val="none"/>
-        </w:rPr>
-        <w:t>standards.»</w:t>
-      </w:r>
-      <w:proofErr w:type="gramEnd"/>
-    </w:p>
-    <w:p>
-      <w:pPr>
-        <w:shd w:val="clear" w:color="auto" w:fill="FFFFFF"/>
-        <w:spacing w:before="240" w:after="0" w:line="240" w:lineRule="auto"/>
-        <w:jc w:val="both"/>
-        <w:rPr>
-          <w:rFonts w:eastAsia="Times New Roman" w:asciiTheme="majorBidi" w:hAnsiTheme="majorBidi" w:cstheme="majorBidi"/>
-          <w:color w:val="373D3F"/>
-          <w:kern w:val="0"/>
-          <w:sz w:val="20"/>
-          <w:szCs w:val="20"/>
-          <w:lang w:eastAsia="en-GB"/>
-          <w14:ligatures w14:val="none"/>
-        </w:rPr>
-      </w:pPr>
-      <w:r>
-        <w:rPr>
-          <w:rFonts w:eastAsia="Times New Roman" w:asciiTheme="majorBidi" w:hAnsiTheme="majorBidi" w:cstheme="majorBidi"/>
-          <w:b/>
-          <w:bCs/>
-          <w:color w:val="373D3F"/>
-          <w:kern w:val="0"/>
-          <w:sz w:val="20"/>
-          <w:szCs w:val="20"/>
-          <w:lang w:eastAsia="en-GB"/>
-          <w14:ligatures w14:val="none"/>
-        </w:rPr>
-        <w:t>2.7. Assumptions and Dependencies</w:t>
-      </w:r>
-    </w:p>
-    <w:p>
-      <w:pPr>
-        <w:shd w:val="clear" w:color="auto" w:fill="FFFFFF"/>
-        <w:spacing w:before="240" w:after="0" w:line="240" w:lineRule="auto"/>
-        <w:jc w:val="both"/>
-        <w:rPr>
-          <w:rFonts w:eastAsia="Times New Roman" w:asciiTheme="majorBidi" w:hAnsiTheme="majorBidi" w:cstheme="majorBidi"/>
-          <w:color w:val="373D3F"/>
-          <w:kern w:val="0"/>
-          <w:sz w:val="20"/>
-          <w:szCs w:val="20"/>
-          <w:lang w:eastAsia="en-GB"/>
-          <w14:ligatures w14:val="none"/>
-        </w:rPr>
-      </w:pPr>
-      <w:r>
-        <w:rPr>
-          <w:rFonts w:eastAsia="Times New Roman" w:asciiTheme="majorBidi" w:hAnsiTheme="majorBidi" w:cstheme="majorBidi"/>
-          <w:color w:val="0000FF"/>
-          <w:kern w:val="0"/>
-          <w:sz w:val="20"/>
-          <w:szCs w:val="20"/>
-          <w:lang w:eastAsia="en-GB"/>
-          <w14:ligatures w14:val="none"/>
-        </w:rPr>
-        <w:t>«List any assumed factors (as opposed to known facts) that could affect the requirements stated in the specification. These could include third-party or commercial components that you plan to use, issues around the development or operating environment, or constraints. The project could be affected if these assumptions are incorrect, are not shared, or change. Also identify any dependencies the project has on external factors, such as software components that you intend to reuse from another project, unless they are already documented elsewhere (for example, in the vision and scope document or the project plan</w:t>
-      </w:r>
-      <w:proofErr w:type="gramStart"/>
-      <w:r>
-        <w:rPr>
-          <w:rFonts w:eastAsia="Times New Roman" w:asciiTheme="majorBidi" w:hAnsiTheme="majorBidi" w:cstheme="majorBidi"/>
-          <w:color w:val="0000FF"/>
-          <w:kern w:val="0"/>
-          <w:sz w:val="20"/>
-          <w:szCs w:val="20"/>
-          <w:lang w:eastAsia="en-GB"/>
-          <w14:ligatures w14:val="none"/>
-        </w:rPr>
-        <w:t>).»</w:t>
-      </w:r>
-      <w:proofErr w:type="gramEnd"/>
-    </w:p>
-    <w:p>
-      <w:pPr>
-        <w:shd w:val="clear" w:color="auto" w:fill="FFFFFF"/>
-        <w:spacing w:before="240" w:after="0" w:line="240" w:lineRule="auto"/>
-        <w:jc w:val="both"/>
-        <w:rPr>
-          <w:rFonts w:eastAsia="Times New Roman" w:asciiTheme="majorBidi" w:hAnsiTheme="majorBidi" w:cstheme="majorBidi"/>
-          <w:color w:val="373D3F"/>
-          <w:kern w:val="0"/>
-          <w:sz w:val="20"/>
-          <w:szCs w:val="20"/>
-          <w:lang w:eastAsia="en-GB"/>
-          <w14:ligatures w14:val="none"/>
-        </w:rPr>
-      </w:pPr>
-      <w:r>
-        <w:rPr>
-          <w:rFonts w:eastAsia="Times New Roman" w:asciiTheme="majorBidi" w:hAnsiTheme="majorBidi" w:cstheme="majorBidi"/>
-          <w:b/>
-          <w:bCs/>
-          <w:color w:val="373D3F"/>
-          <w:kern w:val="0"/>
-          <w:sz w:val="20"/>
-          <w:szCs w:val="20"/>
-          <w:lang w:eastAsia="en-GB"/>
-          <w14:ligatures w14:val="none"/>
-        </w:rPr>
-        <w:t>3. System Features</w:t>
+        <w:t>4.3. Software Interfaces</w:t>
       </w:r>
     </w:p>
     <w:p>
@@ -3222,7 +3798,7 @@
           <w:lang w:eastAsia="en-GB"/>
           <w14:ligatures w14:val="none"/>
         </w:rPr>
-        <w:t xml:space="preserve">«The purpose here is to give a brief introduction to the system features, so that §4 has something to reference. Then, the full explanation of the system features is given in §5, likely referencing §4. The numbering in §3 and §5 should </w:t>
+        <w:t xml:space="preserve">«Describe the connections between this product and other specific software components (name and version), including databases, interpreters, operating systems, tools, libraries, and integrated commercial components. Identify the data items or messages coming into the system and going out and describe the purpose of each. Describe the services needed and the nature of communications. Identify data that will be shared across software components. If the data sharing mechanism must be implemented in a specific way (for example, use of a global data area in a multitasking operating system), specify this as an implementation </w:t>
       </w:r>
       <w:r>
         <w:rPr>
@@ -3234,7 +3810,7 @@
           <w:lang w:eastAsia="en-GB"/>
           <w14:ligatures w14:val="none"/>
         </w:rPr>
-        <w:t>match.»</w:t>
+        <w:t>constraint.»</w:t>
       </w:r>
     </w:p>
     <w:p>
@@ -3250,463 +3826,6 @@
           <w:lang w:eastAsia="en-GB"/>
         </w:rPr>
       </w:pPr>
-    </w:p>
-    <w:p>
-      <w:pPr>
-        <w:shd w:val="clear" w:color="auto" w:fill="FFFFFF"/>
-        <w:spacing w:before="240" w:after="0" w:line="240" w:lineRule="auto"/>
-        <w:jc w:val="both"/>
-        <w:rPr>
-          <w:rFonts w:eastAsia="Times New Roman" w:asciiTheme="majorBidi" w:hAnsiTheme="majorBidi" w:cstheme="majorBidi"/>
-          <w:color w:val="373D3F"/>
-          <w:kern w:val="0"/>
-          <w:sz w:val="20"/>
-          <w:szCs w:val="20"/>
-          <w:lang w:eastAsia="en-GB"/>
-          <w14:ligatures w14:val="none"/>
-        </w:rPr>
-      </w:pPr>
-      <w:r>
-        <w:rPr>
-          <w:rFonts w:eastAsia="Times New Roman" w:asciiTheme="majorBidi" w:hAnsiTheme="majorBidi" w:cstheme="majorBidi"/>
-          <w:b/>
-          <w:bCs/>
-          <w:color w:val="373D3F"/>
-          <w:kern w:val="0"/>
-          <w:sz w:val="20"/>
-          <w:szCs w:val="20"/>
-          <w:lang w:eastAsia="en-GB"/>
-          <w14:ligatures w14:val="none"/>
-        </w:rPr>
-        <w:t>3.1. </w:t>
-      </w:r>
-      <w:r>
-        <w:rPr>
-          <w:rFonts w:eastAsia="Times New Roman" w:asciiTheme="majorBidi" w:hAnsiTheme="majorBidi" w:cstheme="majorBidi"/>
-          <w:b/>
-          <w:bCs/>
-          <w:color w:val="0000FF"/>
-          <w:kern w:val="0"/>
-          <w:sz w:val="20"/>
-          <w:szCs w:val="20"/>
-          <w:lang w:eastAsia="en-GB"/>
-          <w14:ligatures w14:val="none"/>
-        </w:rPr>
-        <w:t>«Feature Name»</w:t>
-      </w:r>
-    </w:p>
-    <w:p>
-      <w:pPr>
-        <w:shd w:val="clear" w:color="auto" w:fill="FFFFFF"/>
-        <w:spacing w:before="240" w:after="0" w:line="240" w:lineRule="auto"/>
-        <w:jc w:val="both"/>
-        <w:rPr>
-          <w:rFonts w:eastAsia="Times New Roman" w:asciiTheme="majorBidi" w:hAnsiTheme="majorBidi" w:cstheme="majorBidi"/>
-          <w:color w:val="373D3F"/>
-          <w:kern w:val="0"/>
-          <w:sz w:val="20"/>
-          <w:szCs w:val="20"/>
-          <w:lang w:eastAsia="en-GB"/>
-          <w14:ligatures w14:val="none"/>
-        </w:rPr>
-      </w:pPr>
-      <w:r>
-        <w:rPr>
-          <w:rFonts w:eastAsia="Times New Roman" w:asciiTheme="majorBidi" w:hAnsiTheme="majorBidi" w:cstheme="majorBidi"/>
-          <w:color w:val="0000FF"/>
-          <w:kern w:val="0"/>
-          <w:sz w:val="20"/>
-          <w:szCs w:val="20"/>
-          <w:lang w:eastAsia="en-GB"/>
-          <w14:ligatures w14:val="none"/>
-        </w:rPr>
-        <w:t>«Brief description of the feature, generally 1-3 sentences»</w:t>
-      </w:r>
-    </w:p>
-    <w:p>
-      <w:pPr>
-        <w:shd w:val="clear" w:color="auto" w:fill="FFFFFF"/>
-        <w:spacing w:before="240" w:after="0" w:line="240" w:lineRule="auto"/>
-        <w:jc w:val="both"/>
-        <w:rPr>
-          <w:rFonts w:eastAsia="Times New Roman" w:asciiTheme="majorBidi" w:hAnsiTheme="majorBidi" w:cstheme="majorBidi"/>
-          <w:color w:val="373D3F"/>
-          <w:kern w:val="0"/>
-          <w:sz w:val="20"/>
-          <w:szCs w:val="20"/>
-          <w:lang w:eastAsia="en-GB"/>
-          <w14:ligatures w14:val="none"/>
-        </w:rPr>
-      </w:pPr>
-      <w:r>
-        <w:rPr>
-          <w:rFonts w:eastAsia="Times New Roman" w:asciiTheme="majorBidi" w:hAnsiTheme="majorBidi" w:cstheme="majorBidi"/>
-          <w:b/>
-          <w:bCs/>
-          <w:color w:val="373D3F"/>
-          <w:kern w:val="0"/>
-          <w:sz w:val="20"/>
-          <w:szCs w:val="20"/>
-          <w:lang w:eastAsia="en-GB"/>
-          <w14:ligatures w14:val="none"/>
-        </w:rPr>
-        <w:t>3.</w:t>
-      </w:r>
-      <w:r>
-        <w:rPr>
-          <w:rFonts w:eastAsia="Times New Roman" w:asciiTheme="majorBidi" w:hAnsiTheme="majorBidi" w:cstheme="majorBidi"/>
-          <w:b/>
-          <w:bCs/>
-          <w:color w:val="0000FF"/>
-          <w:kern w:val="0"/>
-          <w:sz w:val="20"/>
-          <w:szCs w:val="20"/>
-          <w:lang w:eastAsia="en-GB"/>
-          <w14:ligatures w14:val="none"/>
-        </w:rPr>
-        <w:t>«N»</w:t>
-      </w:r>
-      <w:r>
-        <w:rPr>
-          <w:rFonts w:eastAsia="Times New Roman" w:asciiTheme="majorBidi" w:hAnsiTheme="majorBidi" w:cstheme="majorBidi"/>
-          <w:b/>
-          <w:bCs/>
-          <w:color w:val="373D3F"/>
-          <w:kern w:val="0"/>
-          <w:sz w:val="20"/>
-          <w:szCs w:val="20"/>
-          <w:lang w:eastAsia="en-GB"/>
-          <w14:ligatures w14:val="none"/>
-        </w:rPr>
-        <w:t>. </w:t>
-      </w:r>
-      <w:r>
-        <w:rPr>
-          <w:rFonts w:eastAsia="Times New Roman" w:asciiTheme="majorBidi" w:hAnsiTheme="majorBidi" w:cstheme="majorBidi"/>
-          <w:b/>
-          <w:bCs/>
-          <w:color w:val="0000FF"/>
-          <w:kern w:val="0"/>
-          <w:sz w:val="20"/>
-          <w:szCs w:val="20"/>
-          <w:lang w:eastAsia="en-GB"/>
-          <w14:ligatures w14:val="none"/>
-        </w:rPr>
-        <w:t>«Additional feature blocks as needed»</w:t>
-      </w:r>
-    </w:p>
-    <w:p>
-      <w:pPr>
-        <w:shd w:val="clear" w:color="auto" w:fill="FFFFFF"/>
-        <w:spacing w:before="240" w:after="0" w:line="240" w:lineRule="auto"/>
-        <w:jc w:val="both"/>
-        <w:rPr>
-          <w:rFonts w:eastAsia="Times New Roman" w:asciiTheme="majorBidi" w:hAnsiTheme="majorBidi" w:cstheme="majorBidi"/>
-          <w:color w:val="373D3F"/>
-          <w:kern w:val="0"/>
-          <w:sz w:val="20"/>
-          <w:szCs w:val="20"/>
-          <w:lang w:eastAsia="en-GB"/>
-          <w14:ligatures w14:val="none"/>
-        </w:rPr>
-      </w:pPr>
-      <w:r>
-        <w:rPr>
-          <w:rFonts w:eastAsia="Times New Roman" w:asciiTheme="majorBidi" w:hAnsiTheme="majorBidi" w:cstheme="majorBidi"/>
-          <w:b/>
-          <w:bCs/>
-          <w:color w:val="373D3F"/>
-          <w:kern w:val="0"/>
-          <w:sz w:val="20"/>
-          <w:szCs w:val="20"/>
-          <w:lang w:eastAsia="en-GB"/>
-          <w14:ligatures w14:val="none"/>
-        </w:rPr>
-        <w:t>4. External Interface Requirements</w:t>
-      </w:r>
-    </w:p>
-    <w:p>
-      <w:pPr>
-        <w:shd w:val="clear" w:color="auto" w:fill="FFFFFF"/>
-        <w:spacing w:before="240" w:after="0" w:line="240" w:lineRule="auto"/>
-        <w:jc w:val="both"/>
-        <w:rPr>
-          <w:rFonts w:eastAsia="Times New Roman" w:asciiTheme="majorBidi" w:hAnsiTheme="majorBidi" w:cstheme="majorBidi"/>
-          <w:color w:val="373D3F"/>
-          <w:kern w:val="0"/>
-          <w:sz w:val="20"/>
-          <w:szCs w:val="20"/>
-          <w:lang w:eastAsia="en-GB"/>
-          <w14:ligatures w14:val="none"/>
-        </w:rPr>
-      </w:pPr>
-      <w:r>
-        <w:rPr>
-          <w:rFonts w:eastAsia="Times New Roman" w:asciiTheme="majorBidi" w:hAnsiTheme="majorBidi" w:cstheme="majorBidi"/>
-          <w:b/>
-          <w:bCs/>
-          <w:color w:val="373D3F"/>
-          <w:kern w:val="0"/>
-          <w:sz w:val="20"/>
-          <w:szCs w:val="20"/>
-          <w:lang w:eastAsia="en-GB"/>
-          <w14:ligatures w14:val="none"/>
-        </w:rPr>
-        <w:t>4.1. User Interfaces Overview</w:t>
-      </w:r>
-    </w:p>
-    <w:p>
-      <w:pPr>
-        <w:shd w:val="clear" w:color="auto" w:fill="FFFFFF"/>
-        <w:spacing w:before="240" w:after="0" w:line="240" w:lineRule="auto"/>
-        <w:jc w:val="both"/>
-        <w:rPr>
-          <w:rFonts w:eastAsia="Times New Roman" w:asciiTheme="majorBidi" w:hAnsiTheme="majorBidi" w:cstheme="majorBidi"/>
-          <w:color w:val="373D3F"/>
-          <w:kern w:val="0"/>
-          <w:sz w:val="20"/>
-          <w:szCs w:val="20"/>
-          <w:lang w:eastAsia="en-GB"/>
-          <w14:ligatures w14:val="none"/>
-        </w:rPr>
-      </w:pPr>
-      <w:r>
-        <w:rPr>
-          <w:rFonts w:eastAsia="Times New Roman" w:asciiTheme="majorBidi" w:hAnsiTheme="majorBidi" w:cstheme="majorBidi"/>
-          <w:color w:val="0000FF"/>
-          <w:kern w:val="0"/>
-          <w:sz w:val="20"/>
-          <w:szCs w:val="20"/>
-          <w:lang w:eastAsia="en-GB"/>
-          <w14:ligatures w14:val="none"/>
-        </w:rPr>
-        <w:t xml:space="preserve">«Describe the </w:t>
-      </w:r>
-      <w:proofErr w:type="gramStart"/>
-      <w:r>
-        <w:rPr>
-          <w:rFonts w:eastAsia="Times New Roman" w:asciiTheme="majorBidi" w:hAnsiTheme="majorBidi" w:cstheme="majorBidi"/>
-          <w:color w:val="0000FF"/>
-          <w:kern w:val="0"/>
-          <w:sz w:val="20"/>
-          <w:szCs w:val="20"/>
-          <w:lang w:eastAsia="en-GB"/>
-          <w14:ligatures w14:val="none"/>
-        </w:rPr>
-        <w:t>high level</w:t>
-      </w:r>
-      <w:proofErr w:type="gramEnd"/>
-      <w:r>
-        <w:rPr>
-          <w:rFonts w:eastAsia="Times New Roman" w:asciiTheme="majorBidi" w:hAnsiTheme="majorBidi" w:cstheme="majorBidi"/>
-          <w:color w:val="0000FF"/>
-          <w:kern w:val="0"/>
-          <w:sz w:val="20"/>
-          <w:szCs w:val="20"/>
-          <w:lang w:eastAsia="en-GB"/>
-          <w14:ligatures w14:val="none"/>
-        </w:rPr>
-        <w:t xml:space="preserve"> functionality of the system from the user’s perspective. Explain how the user should be able to use your system to complete all the expected features and the feedback information that will be displayed for the user (for each screen the user will see). For example, specify whether it is GUI or </w:t>
-      </w:r>
-      <w:proofErr w:type="gramStart"/>
-      <w:r>
-        <w:rPr>
-          <w:rFonts w:eastAsia="Times New Roman" w:asciiTheme="majorBidi" w:hAnsiTheme="majorBidi" w:cstheme="majorBidi"/>
-          <w:color w:val="0000FF"/>
-          <w:kern w:val="0"/>
-          <w:sz w:val="20"/>
-          <w:szCs w:val="20"/>
-          <w:lang w:eastAsia="en-GB"/>
-          <w14:ligatures w14:val="none"/>
-        </w:rPr>
-        <w:t>text based</w:t>
-      </w:r>
-      <w:proofErr w:type="gramEnd"/>
-      <w:r>
-        <w:rPr>
-          <w:rFonts w:eastAsia="Times New Roman" w:asciiTheme="majorBidi" w:hAnsiTheme="majorBidi" w:cstheme="majorBidi"/>
-          <w:color w:val="0000FF"/>
-          <w:kern w:val="0"/>
-          <w:sz w:val="20"/>
-          <w:szCs w:val="20"/>
-          <w:lang w:eastAsia="en-GB"/>
-          <w14:ligatures w14:val="none"/>
-        </w:rPr>
-        <w:t xml:space="preserve"> interface and how at high level it would work. Discuss at high level how user will interact with the game such as clicking buttons, typing in some selection character, etc.»</w:t>
-      </w:r>
-    </w:p>
-    <w:p>
-      <w:pPr>
-        <w:shd w:val="clear" w:color="auto" w:fill="FFFFFF"/>
-        <w:spacing w:before="240" w:after="0" w:line="240" w:lineRule="auto"/>
-        <w:jc w:val="both"/>
-        <w:rPr>
-          <w:rFonts w:eastAsia="Times New Roman" w:asciiTheme="majorBidi" w:hAnsiTheme="majorBidi" w:cstheme="majorBidi"/>
-          <w:color w:val="373D3F"/>
-          <w:kern w:val="0"/>
-          <w:sz w:val="20"/>
-          <w:szCs w:val="20"/>
-          <w:lang w:eastAsia="en-GB"/>
-          <w14:ligatures w14:val="none"/>
-        </w:rPr>
-      </w:pPr>
-      <w:r>
-        <w:rPr>
-          <w:rFonts w:eastAsia="Times New Roman" w:asciiTheme="majorBidi" w:hAnsiTheme="majorBidi" w:cstheme="majorBidi"/>
-          <w:color w:val="0000FF"/>
-          <w:kern w:val="0"/>
-          <w:sz w:val="20"/>
-          <w:szCs w:val="20"/>
-          <w:lang w:eastAsia="en-GB"/>
-          <w14:ligatures w14:val="none"/>
-        </w:rPr>
-        <w:t>«Describe the minimum requirements for the interface. This may include some sample screen images whether for text or GUI approach, any GUI standards or product family style guides that are to be followed, screen layout constraints, for GUI standard buttons and functions (e.g., help) that must appear on every screen, keyboard shortcuts, error message display standards, and so on»</w:t>
-      </w:r>
-    </w:p>
-    <w:p>
-      <w:pPr>
-        <w:shd w:val="clear" w:color="auto" w:fill="FFFFFF"/>
-        <w:spacing w:before="240" w:after="0" w:line="240" w:lineRule="auto"/>
-        <w:jc w:val="both"/>
-        <w:rPr>
-          <w:rFonts w:eastAsia="Times New Roman" w:asciiTheme="majorBidi" w:hAnsiTheme="majorBidi" w:cstheme="majorBidi"/>
-          <w:color w:val="373D3F"/>
-          <w:kern w:val="0"/>
-          <w:sz w:val="20"/>
-          <w:szCs w:val="20"/>
-          <w:lang w:eastAsia="en-GB"/>
-          <w14:ligatures w14:val="none"/>
-        </w:rPr>
-      </w:pPr>
-      <w:r>
-        <w:rPr>
-          <w:rFonts w:eastAsia="Times New Roman" w:asciiTheme="majorBidi" w:hAnsiTheme="majorBidi" w:cstheme="majorBidi"/>
-          <w:b/>
-          <w:bCs/>
-          <w:color w:val="373D3F"/>
-          <w:kern w:val="0"/>
-          <w:sz w:val="20"/>
-          <w:szCs w:val="20"/>
-          <w:lang w:eastAsia="en-GB"/>
-          <w14:ligatures w14:val="none"/>
-        </w:rPr>
-        <w:lastRenderedPageBreak/>
-        <w:t>4.2. Hardware Interfaces</w:t>
-      </w:r>
-    </w:p>
-    <w:p>
-      <w:pPr>
-        <w:shd w:val="clear" w:color="auto" w:fill="FFFFFF"/>
-        <w:spacing w:before="240" w:after="0" w:line="240" w:lineRule="auto"/>
-        <w:jc w:val="both"/>
-        <w:rPr>
-          <w:rFonts w:eastAsia="Times New Roman" w:asciiTheme="majorBidi" w:hAnsiTheme="majorBidi" w:cstheme="majorBidi"/>
-          <w:color w:val="373D3F"/>
-          <w:kern w:val="0"/>
-          <w:sz w:val="20"/>
-          <w:szCs w:val="20"/>
-          <w:lang w:eastAsia="en-GB"/>
-          <w14:ligatures w14:val="none"/>
-        </w:rPr>
-      </w:pPr>
-      <w:r>
-        <w:rPr>
-          <w:rFonts w:eastAsia="Times New Roman" w:asciiTheme="majorBidi" w:hAnsiTheme="majorBidi" w:cstheme="majorBidi"/>
-          <w:color w:val="0000FF"/>
-          <w:kern w:val="0"/>
-          <w:sz w:val="20"/>
-          <w:szCs w:val="20"/>
-          <w:lang w:eastAsia="en-GB"/>
-          <w14:ligatures w14:val="none"/>
-        </w:rPr>
-        <w:t xml:space="preserve">«Describe the logical and physical characteristics of each interface between the software product and the hardware components of the system. This may include the supported device types, the nature of the data and control interactions between the software and the hardware, and communication protocols to be </w:t>
-      </w:r>
-      <w:proofErr w:type="gramStart"/>
-      <w:r>
-        <w:rPr>
-          <w:rFonts w:eastAsia="Times New Roman" w:asciiTheme="majorBidi" w:hAnsiTheme="majorBidi" w:cstheme="majorBidi"/>
-          <w:color w:val="0000FF"/>
-          <w:kern w:val="0"/>
-          <w:sz w:val="20"/>
-          <w:szCs w:val="20"/>
-          <w:lang w:eastAsia="en-GB"/>
-          <w14:ligatures w14:val="none"/>
-        </w:rPr>
-        <w:t>used.»</w:t>
-      </w:r>
-      <w:proofErr w:type="gramEnd"/>
-    </w:p>
-    <w:p>
-      <w:pPr>
-        <w:shd w:val="clear" w:color="auto" w:fill="FFFFFF"/>
-        <w:spacing w:before="240" w:after="0" w:line="240" w:lineRule="auto"/>
-        <w:jc w:val="both"/>
-        <w:rPr>
-          <w:rFonts w:eastAsia="Times New Roman" w:asciiTheme="majorBidi" w:hAnsiTheme="majorBidi" w:cstheme="majorBidi"/>
-          <w:color w:val="373D3F"/>
-          <w:kern w:val="0"/>
-          <w:sz w:val="20"/>
-          <w:szCs w:val="20"/>
-          <w:lang w:eastAsia="en-GB"/>
-          <w14:ligatures w14:val="none"/>
-        </w:rPr>
-      </w:pPr>
-      <w:r>
-        <w:rPr>
-          <w:rFonts w:eastAsia="Times New Roman" w:asciiTheme="majorBidi" w:hAnsiTheme="majorBidi" w:cstheme="majorBidi"/>
-          <w:b/>
-          <w:bCs/>
-          <w:color w:val="373D3F"/>
-          <w:kern w:val="0"/>
-          <w:sz w:val="20"/>
-          <w:szCs w:val="20"/>
-          <w:lang w:eastAsia="en-GB"/>
-          <w14:ligatures w14:val="none"/>
-        </w:rPr>
-        <w:t>4.3. Software Interfaces</w:t>
-      </w:r>
-    </w:p>
-    <w:p>
-      <w:pPr>
-        <w:shd w:val="clear" w:color="auto" w:fill="FFFFFF"/>
-        <w:spacing w:before="240" w:after="0" w:line="240" w:lineRule="auto"/>
-        <w:jc w:val="both"/>
-        <w:rPr>
-          <w:rFonts w:eastAsia="Times New Roman" w:asciiTheme="majorBidi" w:hAnsiTheme="majorBidi" w:cstheme="majorBidi"/>
-          <w:color w:val="373D3F"/>
-          <w:kern w:val="0"/>
-          <w:sz w:val="20"/>
-          <w:szCs w:val="20"/>
-          <w:lang w:eastAsia="en-GB"/>
-          <w14:ligatures w14:val="none"/>
-        </w:rPr>
-      </w:pPr>
-      <w:r>
-        <w:rPr>
-          <w:rFonts w:eastAsia="Times New Roman" w:asciiTheme="majorBidi" w:hAnsiTheme="majorBidi" w:cstheme="majorBidi"/>
-          <w:color w:val="0000FF"/>
-          <w:kern w:val="0"/>
-          <w:sz w:val="20"/>
-          <w:szCs w:val="20"/>
-          <w:lang w:eastAsia="en-GB"/>
-          <w14:ligatures w14:val="none"/>
-        </w:rPr>
-        <w:t xml:space="preserve">«Describe the connections between this product and other specific software components (name and version), including databases, interpreters, operating systems, tools, libraries, and integrated commercial components. Identify the data items or messages coming into the system and going out and describe the purpose of each. Describe the services needed and the nature of communications. Identify data that will be shared across software components. If the data sharing mechanism must be implemented in a specific way (for example, use of a global data area in a multitasking operating system), specify this as an implementation </w:t>
-      </w:r>
-      <w:proofErr w:type="gramStart"/>
-      <w:r>
-        <w:rPr>
-          <w:rFonts w:eastAsia="Times New Roman" w:asciiTheme="majorBidi" w:hAnsiTheme="majorBidi" w:cstheme="majorBidi"/>
-          <w:color w:val="0000FF"/>
-          <w:kern w:val="0"/>
-          <w:sz w:val="20"/>
-          <w:szCs w:val="20"/>
-          <w:lang w:eastAsia="en-GB"/>
-          <w14:ligatures w14:val="none"/>
-        </w:rPr>
-        <w:t>constraint.»</w:t>
-      </w:r>
-      <w:proofErr w:type="gramEnd"/>
     </w:p>
     <w:p>
       <w:pPr>
@@ -5130,6 +5249,454 @@
 
 <file path=word/numbering.xml><?xml version="1.0" encoding="utf-8"?>
 <w:numbering xmlns:wpc="http://schemas.microsoft.com/office/word/2010/wordprocessingCanvas" xmlns:cx="http://schemas.microsoft.com/office/drawing/2014/chartex" xmlns:cx1="http://schemas.microsoft.com/office/drawing/2015/9/8/chartex" xmlns:cx2="http://schemas.microsoft.com/office/drawing/2015/10/21/chartex" xmlns:cx3="http://schemas.microsoft.com/office/drawing/2016/5/9/chartex" xmlns:cx4="http://schemas.microsoft.com/office/drawing/2016/5/10/chartex" xmlns:cx5="http://schemas.microsoft.com/office/drawing/2016/5/11/chartex" xmlns:cx6="http://schemas.microsoft.com/office/drawing/2016/5/12/chartex" xmlns:cx7="http://schemas.microsoft.com/office/drawing/2016/5/13/chartex" xmlns:cx8="http://schemas.microsoft.com/office/drawing/2016/5/14/chartex" xmlns:mc="http://schemas.openxmlformats.org/markup-compatibility/2006" xmlns:aink="http://schemas.microsoft.com/office/drawing/2016/ink" xmlns:am3d="http://schemas.microsoft.com/office/drawing/2017/model3d" xmlns:o="urn:schemas-microsoft-com:office:office" xmlns:oel="http://schemas.microsoft.com/office/2019/extlst" xmlns:r="http://schemas.openxmlformats.org/officeDocument/2006/relationships" xmlns:m="http://schemas.openxmlformats.org/officeDocument/2006/math" xmlns:v="urn:schemas-microsoft-com:vml" xmlns:wp14="http://schemas.microsoft.com/office/word/2010/wordprocessingDrawing" xmlns:wp="http://schemas.openxmlformats.org/drawingml/2006/wordprocessingDrawing" xmlns:w10="urn:schemas-microsoft-com:office:word" xmlns:w="http://schemas.openxmlformats.org/wordprocessingml/2006/main" xmlns:w14="http://schemas.microsoft.com/office/word/2010/wordml" xmlns:w15="http://schemas.microsoft.com/office/word/2012/wordml" xmlns:w16cex="http://schemas.microsoft.com/office/word/2018/wordml/cex" xmlns:w16cid="http://schemas.microsoft.com/office/word/2016/wordml/cid" xmlns:w16="http://schemas.microsoft.com/office/word/2018/wordml" xmlns:w16du="http://schemas.microsoft.com/office/word/2023/wordml/word16du" xmlns:w16sdtdh="http://schemas.microsoft.com/office/word/2020/wordml/sdtdatahash" xmlns:w16sdtfl="http://schemas.microsoft.com/office/word/2024/wordml/sdtformatlock" xmlns:w16se="http://schemas.microsoft.com/office/word/2015/wordml/symex" xmlns:wpg="http://schemas.microsoft.com/office/word/2010/wordprocessingGroup" xmlns:wpi="http://schemas.microsoft.com/office/word/2010/wordprocessingInk" xmlns:wne="http://schemas.microsoft.com/office/word/2006/wordml" xmlns:wps="http://schemas.microsoft.com/office/word/2010/wordprocessingShape" mc:Ignorable="w14 w15 w16se w16cid w16 w16cex w16sdtdh w16sdtfl w16du wp14">
+  <w:abstractNum xmlns:w="http://schemas.openxmlformats.org/wordprocessingml/2006/main" w:abstractNumId="7">
+    <w:nsid w:val="1eb73d21"/>
+    <w:multiLevelType xmlns:w="http://schemas.openxmlformats.org/wordprocessingml/2006/main" w:val="hybridMultilevel"/>
+    <w:lvl xmlns:w="http://schemas.openxmlformats.org/wordprocessingml/2006/main" w:ilvl="0">
+      <w:start w:val="1"/>
+      <w:numFmt w:val="bullet"/>
+      <w:lvlText w:val=""/>
+      <w:lvlJc w:val="left"/>
+      <w:pPr>
+        <w:ind w:left="720" w:hanging="360"/>
+      </w:pPr>
+      <w:rPr>
+        <w:rFonts w:hint="default" w:ascii="Symbol" w:hAnsi="Symbol"/>
+      </w:rPr>
+    </w:lvl>
+    <w:lvl xmlns:w="http://schemas.openxmlformats.org/wordprocessingml/2006/main" w:ilvl="1">
+      <w:start w:val="1"/>
+      <w:numFmt w:val="bullet"/>
+      <w:lvlText w:val="o"/>
+      <w:lvlJc w:val="left"/>
+      <w:pPr>
+        <w:ind w:left="1440" w:hanging="360"/>
+      </w:pPr>
+      <w:rPr>
+        <w:rFonts w:hint="default" w:ascii="Courier New" w:hAnsi="Courier New"/>
+      </w:rPr>
+    </w:lvl>
+    <w:lvl xmlns:w="http://schemas.openxmlformats.org/wordprocessingml/2006/main" w:ilvl="2">
+      <w:start w:val="1"/>
+      <w:numFmt w:val="bullet"/>
+      <w:lvlText w:val=""/>
+      <w:lvlJc w:val="left"/>
+      <w:pPr>
+        <w:ind w:left="2160" w:hanging="360"/>
+      </w:pPr>
+      <w:rPr>
+        <w:rFonts w:hint="default" w:ascii="Wingdings" w:hAnsi="Wingdings"/>
+      </w:rPr>
+    </w:lvl>
+    <w:lvl xmlns:w="http://schemas.openxmlformats.org/wordprocessingml/2006/main" w:ilvl="3">
+      <w:start w:val="1"/>
+      <w:numFmt w:val="bullet"/>
+      <w:lvlText w:val=""/>
+      <w:lvlJc w:val="left"/>
+      <w:pPr>
+        <w:ind w:left="2880" w:hanging="360"/>
+      </w:pPr>
+      <w:rPr>
+        <w:rFonts w:hint="default" w:ascii="Symbol" w:hAnsi="Symbol"/>
+      </w:rPr>
+    </w:lvl>
+    <w:lvl xmlns:w="http://schemas.openxmlformats.org/wordprocessingml/2006/main" w:ilvl="4">
+      <w:start w:val="1"/>
+      <w:numFmt w:val="bullet"/>
+      <w:lvlText w:val="o"/>
+      <w:lvlJc w:val="left"/>
+      <w:pPr>
+        <w:ind w:left="3600" w:hanging="360"/>
+      </w:pPr>
+      <w:rPr>
+        <w:rFonts w:hint="default" w:ascii="Courier New" w:hAnsi="Courier New"/>
+      </w:rPr>
+    </w:lvl>
+    <w:lvl xmlns:w="http://schemas.openxmlformats.org/wordprocessingml/2006/main" w:ilvl="5">
+      <w:start w:val="1"/>
+      <w:numFmt w:val="bullet"/>
+      <w:lvlText w:val=""/>
+      <w:lvlJc w:val="left"/>
+      <w:pPr>
+        <w:ind w:left="4320" w:hanging="360"/>
+      </w:pPr>
+      <w:rPr>
+        <w:rFonts w:hint="default" w:ascii="Wingdings" w:hAnsi="Wingdings"/>
+      </w:rPr>
+    </w:lvl>
+    <w:lvl xmlns:w="http://schemas.openxmlformats.org/wordprocessingml/2006/main" w:ilvl="6">
+      <w:start w:val="1"/>
+      <w:numFmt w:val="bullet"/>
+      <w:lvlText w:val=""/>
+      <w:lvlJc w:val="left"/>
+      <w:pPr>
+        <w:ind w:left="5040" w:hanging="360"/>
+      </w:pPr>
+      <w:rPr>
+        <w:rFonts w:hint="default" w:ascii="Symbol" w:hAnsi="Symbol"/>
+      </w:rPr>
+    </w:lvl>
+    <w:lvl xmlns:w="http://schemas.openxmlformats.org/wordprocessingml/2006/main" w:ilvl="7">
+      <w:start w:val="1"/>
+      <w:numFmt w:val="bullet"/>
+      <w:lvlText w:val="o"/>
+      <w:lvlJc w:val="left"/>
+      <w:pPr>
+        <w:ind w:left="5760" w:hanging="360"/>
+      </w:pPr>
+      <w:rPr>
+        <w:rFonts w:hint="default" w:ascii="Courier New" w:hAnsi="Courier New"/>
+      </w:rPr>
+    </w:lvl>
+    <w:lvl xmlns:w="http://schemas.openxmlformats.org/wordprocessingml/2006/main" w:ilvl="8">
+      <w:start w:val="1"/>
+      <w:numFmt w:val="bullet"/>
+      <w:lvlText w:val=""/>
+      <w:lvlJc w:val="left"/>
+      <w:pPr>
+        <w:ind w:left="6480" w:hanging="360"/>
+      </w:pPr>
+      <w:rPr>
+        <w:rFonts w:hint="default" w:ascii="Wingdings" w:hAnsi="Wingdings"/>
+      </w:rPr>
+    </w:lvl>
+  </w:abstractNum>
+  <w:abstractNum xmlns:w="http://schemas.openxmlformats.org/wordprocessingml/2006/main" w:abstractNumId="6">
+    <w:nsid w:val="661922b9"/>
+    <w:multiLevelType xmlns:w="http://schemas.openxmlformats.org/wordprocessingml/2006/main" w:val="hybridMultilevel"/>
+    <w:lvl xmlns:w="http://schemas.openxmlformats.org/wordprocessingml/2006/main" w:ilvl="0">
+      <w:start w:val="1"/>
+      <w:numFmt w:val="bullet"/>
+      <w:lvlText w:val=""/>
+      <w:lvlJc w:val="left"/>
+      <w:pPr>
+        <w:ind w:left="720" w:hanging="360"/>
+      </w:pPr>
+      <w:rPr>
+        <w:rFonts w:hint="default" w:ascii="Symbol" w:hAnsi="Symbol"/>
+      </w:rPr>
+    </w:lvl>
+    <w:lvl xmlns:w="http://schemas.openxmlformats.org/wordprocessingml/2006/main" w:ilvl="1">
+      <w:start w:val="1"/>
+      <w:numFmt w:val="bullet"/>
+      <w:lvlText w:val="o"/>
+      <w:lvlJc w:val="left"/>
+      <w:pPr>
+        <w:ind w:left="1440" w:hanging="360"/>
+      </w:pPr>
+      <w:rPr>
+        <w:rFonts w:hint="default" w:ascii="Courier New" w:hAnsi="Courier New"/>
+      </w:rPr>
+    </w:lvl>
+    <w:lvl xmlns:w="http://schemas.openxmlformats.org/wordprocessingml/2006/main" w:ilvl="2">
+      <w:start w:val="1"/>
+      <w:numFmt w:val="bullet"/>
+      <w:lvlText w:val=""/>
+      <w:lvlJc w:val="left"/>
+      <w:pPr>
+        <w:ind w:left="2160" w:hanging="360"/>
+      </w:pPr>
+      <w:rPr>
+        <w:rFonts w:hint="default" w:ascii="Wingdings" w:hAnsi="Wingdings"/>
+      </w:rPr>
+    </w:lvl>
+    <w:lvl xmlns:w="http://schemas.openxmlformats.org/wordprocessingml/2006/main" w:ilvl="3">
+      <w:start w:val="1"/>
+      <w:numFmt w:val="bullet"/>
+      <w:lvlText w:val=""/>
+      <w:lvlJc w:val="left"/>
+      <w:pPr>
+        <w:ind w:left="2880" w:hanging="360"/>
+      </w:pPr>
+      <w:rPr>
+        <w:rFonts w:hint="default" w:ascii="Symbol" w:hAnsi="Symbol"/>
+      </w:rPr>
+    </w:lvl>
+    <w:lvl xmlns:w="http://schemas.openxmlformats.org/wordprocessingml/2006/main" w:ilvl="4">
+      <w:start w:val="1"/>
+      <w:numFmt w:val="bullet"/>
+      <w:lvlText w:val="o"/>
+      <w:lvlJc w:val="left"/>
+      <w:pPr>
+        <w:ind w:left="3600" w:hanging="360"/>
+      </w:pPr>
+      <w:rPr>
+        <w:rFonts w:hint="default" w:ascii="Courier New" w:hAnsi="Courier New"/>
+      </w:rPr>
+    </w:lvl>
+    <w:lvl xmlns:w="http://schemas.openxmlformats.org/wordprocessingml/2006/main" w:ilvl="5">
+      <w:start w:val="1"/>
+      <w:numFmt w:val="bullet"/>
+      <w:lvlText w:val=""/>
+      <w:lvlJc w:val="left"/>
+      <w:pPr>
+        <w:ind w:left="4320" w:hanging="360"/>
+      </w:pPr>
+      <w:rPr>
+        <w:rFonts w:hint="default" w:ascii="Wingdings" w:hAnsi="Wingdings"/>
+      </w:rPr>
+    </w:lvl>
+    <w:lvl xmlns:w="http://schemas.openxmlformats.org/wordprocessingml/2006/main" w:ilvl="6">
+      <w:start w:val="1"/>
+      <w:numFmt w:val="bullet"/>
+      <w:lvlText w:val=""/>
+      <w:lvlJc w:val="left"/>
+      <w:pPr>
+        <w:ind w:left="5040" w:hanging="360"/>
+      </w:pPr>
+      <w:rPr>
+        <w:rFonts w:hint="default" w:ascii="Symbol" w:hAnsi="Symbol"/>
+      </w:rPr>
+    </w:lvl>
+    <w:lvl xmlns:w="http://schemas.openxmlformats.org/wordprocessingml/2006/main" w:ilvl="7">
+      <w:start w:val="1"/>
+      <w:numFmt w:val="bullet"/>
+      <w:lvlText w:val="o"/>
+      <w:lvlJc w:val="left"/>
+      <w:pPr>
+        <w:ind w:left="5760" w:hanging="360"/>
+      </w:pPr>
+      <w:rPr>
+        <w:rFonts w:hint="default" w:ascii="Courier New" w:hAnsi="Courier New"/>
+      </w:rPr>
+    </w:lvl>
+    <w:lvl xmlns:w="http://schemas.openxmlformats.org/wordprocessingml/2006/main" w:ilvl="8">
+      <w:start w:val="1"/>
+      <w:numFmt w:val="bullet"/>
+      <w:lvlText w:val=""/>
+      <w:lvlJc w:val="left"/>
+      <w:pPr>
+        <w:ind w:left="6480" w:hanging="360"/>
+      </w:pPr>
+      <w:rPr>
+        <w:rFonts w:hint="default" w:ascii="Wingdings" w:hAnsi="Wingdings"/>
+      </w:rPr>
+    </w:lvl>
+  </w:abstractNum>
+  <w:abstractNum xmlns:w="http://schemas.openxmlformats.org/wordprocessingml/2006/main" w:abstractNumId="5">
+    <w:nsid w:val="3f8cb3a5"/>
+    <w:multiLevelType xmlns:w="http://schemas.openxmlformats.org/wordprocessingml/2006/main" w:val="hybridMultilevel"/>
+    <w:lvl xmlns:w="http://schemas.openxmlformats.org/wordprocessingml/2006/main" w:ilvl="0">
+      <w:start w:val="1"/>
+      <w:numFmt w:val="bullet"/>
+      <w:lvlText w:val=""/>
+      <w:lvlJc w:val="left"/>
+      <w:pPr>
+        <w:ind w:left="720" w:hanging="360"/>
+      </w:pPr>
+      <w:rPr>
+        <w:rFonts w:hint="default" w:ascii="Symbol" w:hAnsi="Symbol"/>
+      </w:rPr>
+    </w:lvl>
+    <w:lvl xmlns:w="http://schemas.openxmlformats.org/wordprocessingml/2006/main" w:ilvl="1">
+      <w:start w:val="1"/>
+      <w:numFmt w:val="bullet"/>
+      <w:lvlText w:val="o"/>
+      <w:lvlJc w:val="left"/>
+      <w:pPr>
+        <w:ind w:left="1440" w:hanging="360"/>
+      </w:pPr>
+      <w:rPr>
+        <w:rFonts w:hint="default" w:ascii="Courier New" w:hAnsi="Courier New"/>
+      </w:rPr>
+    </w:lvl>
+    <w:lvl xmlns:w="http://schemas.openxmlformats.org/wordprocessingml/2006/main" w:ilvl="2">
+      <w:start w:val="1"/>
+      <w:numFmt w:val="bullet"/>
+      <w:lvlText w:val=""/>
+      <w:lvlJc w:val="left"/>
+      <w:pPr>
+        <w:ind w:left="2160" w:hanging="360"/>
+      </w:pPr>
+      <w:rPr>
+        <w:rFonts w:hint="default" w:ascii="Wingdings" w:hAnsi="Wingdings"/>
+      </w:rPr>
+    </w:lvl>
+    <w:lvl xmlns:w="http://schemas.openxmlformats.org/wordprocessingml/2006/main" w:ilvl="3">
+      <w:start w:val="1"/>
+      <w:numFmt w:val="bullet"/>
+      <w:lvlText w:val=""/>
+      <w:lvlJc w:val="left"/>
+      <w:pPr>
+        <w:ind w:left="2880" w:hanging="360"/>
+      </w:pPr>
+      <w:rPr>
+        <w:rFonts w:hint="default" w:ascii="Symbol" w:hAnsi="Symbol"/>
+      </w:rPr>
+    </w:lvl>
+    <w:lvl xmlns:w="http://schemas.openxmlformats.org/wordprocessingml/2006/main" w:ilvl="4">
+      <w:start w:val="1"/>
+      <w:numFmt w:val="bullet"/>
+      <w:lvlText w:val="o"/>
+      <w:lvlJc w:val="left"/>
+      <w:pPr>
+        <w:ind w:left="3600" w:hanging="360"/>
+      </w:pPr>
+      <w:rPr>
+        <w:rFonts w:hint="default" w:ascii="Courier New" w:hAnsi="Courier New"/>
+      </w:rPr>
+    </w:lvl>
+    <w:lvl xmlns:w="http://schemas.openxmlformats.org/wordprocessingml/2006/main" w:ilvl="5">
+      <w:start w:val="1"/>
+      <w:numFmt w:val="bullet"/>
+      <w:lvlText w:val=""/>
+      <w:lvlJc w:val="left"/>
+      <w:pPr>
+        <w:ind w:left="4320" w:hanging="360"/>
+      </w:pPr>
+      <w:rPr>
+        <w:rFonts w:hint="default" w:ascii="Wingdings" w:hAnsi="Wingdings"/>
+      </w:rPr>
+    </w:lvl>
+    <w:lvl xmlns:w="http://schemas.openxmlformats.org/wordprocessingml/2006/main" w:ilvl="6">
+      <w:start w:val="1"/>
+      <w:numFmt w:val="bullet"/>
+      <w:lvlText w:val=""/>
+      <w:lvlJc w:val="left"/>
+      <w:pPr>
+        <w:ind w:left="5040" w:hanging="360"/>
+      </w:pPr>
+      <w:rPr>
+        <w:rFonts w:hint="default" w:ascii="Symbol" w:hAnsi="Symbol"/>
+      </w:rPr>
+    </w:lvl>
+    <w:lvl xmlns:w="http://schemas.openxmlformats.org/wordprocessingml/2006/main" w:ilvl="7">
+      <w:start w:val="1"/>
+      <w:numFmt w:val="bullet"/>
+      <w:lvlText w:val="o"/>
+      <w:lvlJc w:val="left"/>
+      <w:pPr>
+        <w:ind w:left="5760" w:hanging="360"/>
+      </w:pPr>
+      <w:rPr>
+        <w:rFonts w:hint="default" w:ascii="Courier New" w:hAnsi="Courier New"/>
+      </w:rPr>
+    </w:lvl>
+    <w:lvl xmlns:w="http://schemas.openxmlformats.org/wordprocessingml/2006/main" w:ilvl="8">
+      <w:start w:val="1"/>
+      <w:numFmt w:val="bullet"/>
+      <w:lvlText w:val=""/>
+      <w:lvlJc w:val="left"/>
+      <w:pPr>
+        <w:ind w:left="6480" w:hanging="360"/>
+      </w:pPr>
+      <w:rPr>
+        <w:rFonts w:hint="default" w:ascii="Wingdings" w:hAnsi="Wingdings"/>
+      </w:rPr>
+    </w:lvl>
+  </w:abstractNum>
+  <w:abstractNum xmlns:w="http://schemas.openxmlformats.org/wordprocessingml/2006/main" w:abstractNumId="4">
+    <w:nsid w:val="59a71bf4"/>
+    <w:multiLevelType xmlns:w="http://schemas.openxmlformats.org/wordprocessingml/2006/main" w:val="hybridMultilevel"/>
+    <w:lvl xmlns:w="http://schemas.openxmlformats.org/wordprocessingml/2006/main" w:ilvl="0">
+      <w:start w:val="1"/>
+      <w:numFmt w:val="bullet"/>
+      <w:lvlText w:val=""/>
+      <w:lvlJc w:val="left"/>
+      <w:pPr>
+        <w:ind w:left="720" w:hanging="360"/>
+      </w:pPr>
+      <w:rPr>
+        <w:rFonts w:hint="default" w:ascii="Symbol" w:hAnsi="Symbol"/>
+      </w:rPr>
+    </w:lvl>
+    <w:lvl xmlns:w="http://schemas.openxmlformats.org/wordprocessingml/2006/main" w:ilvl="1">
+      <w:start w:val="1"/>
+      <w:numFmt w:val="bullet"/>
+      <w:lvlText w:val="o"/>
+      <w:lvlJc w:val="left"/>
+      <w:pPr>
+        <w:ind w:left="1440" w:hanging="360"/>
+      </w:pPr>
+      <w:rPr>
+        <w:rFonts w:hint="default" w:ascii="Courier New" w:hAnsi="Courier New"/>
+      </w:rPr>
+    </w:lvl>
+    <w:lvl xmlns:w="http://schemas.openxmlformats.org/wordprocessingml/2006/main" w:ilvl="2">
+      <w:start w:val="1"/>
+      <w:numFmt w:val="bullet"/>
+      <w:lvlText w:val=""/>
+      <w:lvlJc w:val="left"/>
+      <w:pPr>
+        <w:ind w:left="2160" w:hanging="360"/>
+      </w:pPr>
+      <w:rPr>
+        <w:rFonts w:hint="default" w:ascii="Wingdings" w:hAnsi="Wingdings"/>
+      </w:rPr>
+    </w:lvl>
+    <w:lvl xmlns:w="http://schemas.openxmlformats.org/wordprocessingml/2006/main" w:ilvl="3">
+      <w:start w:val="1"/>
+      <w:numFmt w:val="bullet"/>
+      <w:lvlText w:val=""/>
+      <w:lvlJc w:val="left"/>
+      <w:pPr>
+        <w:ind w:left="2880" w:hanging="360"/>
+      </w:pPr>
+      <w:rPr>
+        <w:rFonts w:hint="default" w:ascii="Symbol" w:hAnsi="Symbol"/>
+      </w:rPr>
+    </w:lvl>
+    <w:lvl xmlns:w="http://schemas.openxmlformats.org/wordprocessingml/2006/main" w:ilvl="4">
+      <w:start w:val="1"/>
+      <w:numFmt w:val="bullet"/>
+      <w:lvlText w:val="o"/>
+      <w:lvlJc w:val="left"/>
+      <w:pPr>
+        <w:ind w:left="3600" w:hanging="360"/>
+      </w:pPr>
+      <w:rPr>
+        <w:rFonts w:hint="default" w:ascii="Courier New" w:hAnsi="Courier New"/>
+      </w:rPr>
+    </w:lvl>
+    <w:lvl xmlns:w="http://schemas.openxmlformats.org/wordprocessingml/2006/main" w:ilvl="5">
+      <w:start w:val="1"/>
+      <w:numFmt w:val="bullet"/>
+      <w:lvlText w:val=""/>
+      <w:lvlJc w:val="left"/>
+      <w:pPr>
+        <w:ind w:left="4320" w:hanging="360"/>
+      </w:pPr>
+      <w:rPr>
+        <w:rFonts w:hint="default" w:ascii="Wingdings" w:hAnsi="Wingdings"/>
+      </w:rPr>
+    </w:lvl>
+    <w:lvl xmlns:w="http://schemas.openxmlformats.org/wordprocessingml/2006/main" w:ilvl="6">
+      <w:start w:val="1"/>
+      <w:numFmt w:val="bullet"/>
+      <w:lvlText w:val=""/>
+      <w:lvlJc w:val="left"/>
+      <w:pPr>
+        <w:ind w:left="5040" w:hanging="360"/>
+      </w:pPr>
+      <w:rPr>
+        <w:rFonts w:hint="default" w:ascii="Symbol" w:hAnsi="Symbol"/>
+      </w:rPr>
+    </w:lvl>
+    <w:lvl xmlns:w="http://schemas.openxmlformats.org/wordprocessingml/2006/main" w:ilvl="7">
+      <w:start w:val="1"/>
+      <w:numFmt w:val="bullet"/>
+      <w:lvlText w:val="o"/>
+      <w:lvlJc w:val="left"/>
+      <w:pPr>
+        <w:ind w:left="5760" w:hanging="360"/>
+      </w:pPr>
+      <w:rPr>
+        <w:rFonts w:hint="default" w:ascii="Courier New" w:hAnsi="Courier New"/>
+      </w:rPr>
+    </w:lvl>
+    <w:lvl xmlns:w="http://schemas.openxmlformats.org/wordprocessingml/2006/main" w:ilvl="8">
+      <w:start w:val="1"/>
+      <w:numFmt w:val="bullet"/>
+      <w:lvlText w:val=""/>
+      <w:lvlJc w:val="left"/>
+      <w:pPr>
+        <w:ind w:left="6480" w:hanging="360"/>
+      </w:pPr>
+      <w:rPr>
+        <w:rFonts w:hint="default" w:ascii="Wingdings" w:hAnsi="Wingdings"/>
+      </w:rPr>
+    </w:lvl>
+  </w:abstractNum>
   <w:abstractNum xmlns:w="http://schemas.openxmlformats.org/wordprocessingml/2006/main" w:abstractNumId="3">
     <w:nsid w:val="502ba9bd"/>
     <w:multiLevelType xmlns:w="http://schemas.openxmlformats.org/wordprocessingml/2006/main" w:val="hybridMultilevel"/>
@@ -5652,6 +6219,18 @@
       </w:rPr>
     </w:lvl>
   </w:abstractNum>
+  <w:num w:numId="8">
+    <w:abstractNumId w:val="7"/>
+  </w:num>
+  <w:num w:numId="7">
+    <w:abstractNumId w:val="6"/>
+  </w:num>
+  <w:num w:numId="6">
+    <w:abstractNumId w:val="5"/>
+  </w:num>
+  <w:num w:numId="5">
+    <w:abstractNumId w:val="4"/>
+  </w:num>
   <w:num w:numId="4">
     <w:abstractNumId w:val="3"/>
   </w:num>

</xml_diff>